<commit_message>
DIP-4: Update unified report status and backlog, add PDF export
</commit_message>
<xml_diff>
--- a/project_report.docx
+++ b/project_report.docx
@@ -161,8 +161,101 @@
           <w:color w:val="24364B"/>
           <w:sz w:val="20"/>
         </w:rPr>
-        <w:t xml:space="preserve"> 25 октября 2026 года</w:t>
+        <w:t xml:space="preserve"> 26 октября 2026 года</w:t>
       </w:r>
+    </w:p>
+    <w:p>
+      <w:r>
+        <w:rPr>
+          <w:rFonts w:ascii="Arial" w:hAnsi="Arial" w:eastAsia="Arial"/>
+          <w:b/>
+          <w:i w:val="0"/>
+          <w:color w:val="24364B"/>
+          <w:sz w:val="20"/>
+        </w:rPr>
+        <w:t>Репозиторий:</w:t>
+      </w:r>
+      <w:r>
+        <w:rPr>
+          <w:rFonts w:ascii="Arial" w:hAnsi="Arial" w:eastAsia="Arial"/>
+          <w:b w:val="0"/>
+          <w:i w:val="0"/>
+          <w:color w:val="24364B"/>
+          <w:sz w:val="20"/>
+        </w:rPr>
+        <w:t xml:space="preserve"> </w:t>
+      </w:r>
+      <w:hyperlink r:id="rId11">
+        <w:r>
+          <w:rPr>
+            <w:color w:val="175CD3"/>
+            <w:u w:val="single"/>
+          </w:rPr>
+          <w:t>https://github.com/jsowkw1/internship-vacancy-search</w:t>
+        </w:r>
+      </w:hyperlink>
+      <w:r>
+        <w:rPr>
+          <w:rFonts w:ascii="Arial" w:hAnsi="Arial" w:eastAsia="Arial"/>
+          <w:b w:val="0"/>
+          <w:i w:val="0"/>
+          <w:color w:val="24364B"/>
+          <w:sz w:val="20"/>
+        </w:rPr>
+        <w:t xml:space="preserve"> (тег </w:t>
+      </w:r>
+      <w:r>
+        <w:rPr>
+          <w:rFonts w:ascii="Consolas" w:hAnsi="Consolas" w:eastAsia="Consolas"/>
+          <w:b w:val="0"/>
+          <w:i w:val="0"/>
+          <w:color w:val="175CD3"/>
+          <w:sz w:val="18"/>
+          <w:shd w:fill="F1F4F8"/>
+        </w:rPr>
+        <w:t>pre-defense-1</w:t>
+      </w:r>
+      <w:r>
+        <w:rPr>
+          <w:rFonts w:ascii="Arial" w:hAnsi="Arial" w:eastAsia="Arial"/>
+          <w:b w:val="0"/>
+          <w:i w:val="0"/>
+          <w:color w:val="24364B"/>
+          <w:sz w:val="20"/>
+        </w:rPr>
+        <w:t>)</w:t>
+      </w:r>
+    </w:p>
+    <w:p>
+      <w:r>
+        <w:rPr>
+          <w:rFonts w:ascii="Arial" w:hAnsi="Arial" w:eastAsia="Arial"/>
+          <w:b/>
+          <w:i w:val="0"/>
+          <w:color w:val="24364B"/>
+          <w:sz w:val="20"/>
+        </w:rPr>
+        <w:t>YouTrack:</w:t>
+      </w:r>
+      <w:r>
+        <w:rPr>
+          <w:rFonts w:ascii="Arial" w:hAnsi="Arial" w:eastAsia="Arial"/>
+          <w:b w:val="0"/>
+          <w:i w:val="0"/>
+          <w:color w:val="24364B"/>
+          <w:sz w:val="20"/>
+        </w:rPr>
+        <w:t xml:space="preserve"> </w:t>
+      </w:r>
+      <w:hyperlink r:id="rId12">
+        <w:r>
+          <w:rPr>
+            <w:color w:val="175CD3"/>
+            <w:u w:val="single"/>
+          </w:rPr>
+          <w:t>https://jsowkw1.youtrack.cloud/projects/DIP</w:t>
+        </w:r>
+      </w:hyperlink>
     </w:p>
     <w:p>
       <w:pPr>
@@ -179,17 +272,376 @@
         <w:t>Статус материалов</w:t>
       </w:r>
     </w:p>
+    <w:tbl>
+      <w:tblPr>
+        <w:tblStyle w:val="TableGrid"/>
+        <w:tblW w:type="auto" w:w="0"/>
+        <w:jc w:val="center"/>
+        <w:tblLayout w:type="autofit"/>
+        <w:tblLook w:firstColumn="1" w:firstRow="1" w:lastColumn="0" w:lastRow="0" w:noHBand="0" w:noVBand="1" w:val="04A0"/>
+        <w:tblBorders>
+          <w:top w:val="single" w:sz="5" w:space="0" w:color="D7E0EA"/>
+          <w:left w:val="single" w:sz="5" w:space="0" w:color="D7E0EA"/>
+          <w:bottom w:val="single" w:sz="5" w:space="0" w:color="D7E0EA"/>
+          <w:right w:val="single" w:sz="5" w:space="0" w:color="D7E0EA"/>
+          <w:insideH w:val="single" w:sz="5" w:space="0" w:color="D7E0EA"/>
+          <w:insideV w:val="single" w:sz="5" w:space="0" w:color="D7E0EA"/>
+        </w:tblBorders>
+      </w:tblPr>
+      <w:tblGrid>
+        <w:gridCol w:w="4917"/>
+        <w:gridCol w:w="4917"/>
+      </w:tblGrid>
+      <w:tr>
+        <w:trPr>
+          <w:tblHeader w:val="true"/>
+        </w:trPr>
+        <w:tc>
+          <w:tcPr>
+            <w:tcW w:type="dxa" w:w="4917"/>
+            <w:shd w:fill="172B4D"/>
+            <w:tcMar>
+              <w:top w:w="90" w:type="dxa"/>
+              <w:start w:w="95" w:type="dxa"/>
+              <w:bottom w:w="90" w:type="dxa"/>
+              <w:end w:w="95" w:type="dxa"/>
+            </w:tcMar>
+            <w:vAlign w:val="center"/>
+          </w:tcPr>
+          <w:p>
+            <w:pPr>
+              <w:spacing w:after="0" w:before="0" w:line="240" w:lineRule="auto"/>
+            </w:pPr>
+            <w:r>
+              <w:rPr>
+                <w:rFonts w:ascii="Arial" w:hAnsi="Arial" w:eastAsia="Arial"/>
+                <w:b/>
+                <w:i w:val="0"/>
+                <w:color w:val="FFFFFF"/>
+                <w:sz w:val="16"/>
+              </w:rPr>
+              <w:t>Компонент</w:t>
+            </w:r>
+          </w:p>
+        </w:tc>
+        <w:tc>
+          <w:tcPr>
+            <w:tcW w:type="dxa" w:w="4917"/>
+            <w:shd w:fill="172B4D"/>
+            <w:tcMar>
+              <w:top w:w="90" w:type="dxa"/>
+              <w:start w:w="95" w:type="dxa"/>
+              <w:bottom w:w="90" w:type="dxa"/>
+              <w:end w:w="95" w:type="dxa"/>
+            </w:tcMar>
+            <w:vAlign w:val="center"/>
+          </w:tcPr>
+          <w:p>
+            <w:pPr>
+              <w:spacing w:after="0" w:before="0" w:line="240" w:lineRule="auto"/>
+            </w:pPr>
+            <w:r>
+              <w:rPr>
+                <w:rFonts w:ascii="Arial" w:hAnsi="Arial" w:eastAsia="Arial"/>
+                <w:b/>
+                <w:i w:val="0"/>
+                <w:color w:val="FFFFFF"/>
+                <w:sz w:val="16"/>
+              </w:rPr>
+              <w:t>Статус</w:t>
+            </w:r>
+          </w:p>
+        </w:tc>
+      </w:tr>
+      <w:tr>
+        <w:tc>
+          <w:tcPr>
+            <w:tcW w:type="dxa" w:w="4917"/>
+            <w:tcMar>
+              <w:top w:w="75" w:type="dxa"/>
+              <w:start w:w="85" w:type="dxa"/>
+              <w:bottom w:w="75" w:type="dxa"/>
+              <w:end w:w="85" w:type="dxa"/>
+            </w:tcMar>
+            <w:vAlign w:val="top"/>
+          </w:tcPr>
+          <w:p>
+            <w:pPr>
+              <w:spacing w:after="0" w:before="0" w:line="245" w:lineRule="auto"/>
+            </w:pPr>
+            <w:r>
+              <w:rPr>
+                <w:rFonts w:ascii="Arial" w:hAnsi="Arial" w:eastAsia="Arial"/>
+                <w:b w:val="0"/>
+                <w:i w:val="0"/>
+                <w:color w:val="24364B"/>
+                <w:sz w:val="15"/>
+              </w:rPr>
+              <w:t>Предложение, обзор литературы, сравнение систем и технологий, требования, архитектура, прототип, план оценки</w:t>
+            </w:r>
+          </w:p>
+        </w:tc>
+        <w:tc>
+          <w:tcPr>
+            <w:tcW w:type="dxa" w:w="4917"/>
+            <w:tcMar>
+              <w:top w:w="75" w:type="dxa"/>
+              <w:start w:w="85" w:type="dxa"/>
+              <w:bottom w:w="75" w:type="dxa"/>
+              <w:end w:w="85" w:type="dxa"/>
+            </w:tcMar>
+            <w:vAlign w:val="top"/>
+          </w:tcPr>
+          <w:p>
+            <w:pPr>
+              <w:spacing w:after="0" w:before="0" w:line="245" w:lineRule="auto"/>
+            </w:pPr>
+            <w:r>
+              <w:rPr>
+                <w:rFonts w:ascii="Arial" w:hAnsi="Arial" w:eastAsia="Arial"/>
+                <w:b w:val="0"/>
+                <w:i w:val="0"/>
+                <w:color w:val="24364B"/>
+                <w:sz w:val="15"/>
+              </w:rPr>
+              <w:t>Подготовлены (черновик для проверки руководителем)</w:t>
+            </w:r>
+          </w:p>
+        </w:tc>
+      </w:tr>
+      <w:tr>
+        <w:tc>
+          <w:tcPr>
+            <w:tcW w:type="dxa" w:w="4917"/>
+            <w:tcMar>
+              <w:top w:w="75" w:type="dxa"/>
+              <w:start w:w="85" w:type="dxa"/>
+              <w:bottom w:w="75" w:type="dxa"/>
+              <w:end w:w="85" w:type="dxa"/>
+            </w:tcMar>
+            <w:vAlign w:val="top"/>
+            <w:shd w:fill="F7F9FC"/>
+          </w:tcPr>
+          <w:p>
+            <w:pPr>
+              <w:spacing w:after="0" w:before="0" w:line="245" w:lineRule="auto"/>
+            </w:pPr>
+            <w:r>
+              <w:rPr>
+                <w:rFonts w:ascii="Arial" w:hAnsi="Arial" w:eastAsia="Arial"/>
+                <w:b w:val="0"/>
+                <w:i w:val="0"/>
+                <w:color w:val="24364B"/>
+                <w:sz w:val="15"/>
+              </w:rPr>
+              <w:t>Репозиторий GitHub и проект YouTrack (17 задач с приоритетом, ответственным, сроком и критериями приёмки)</w:t>
+            </w:r>
+          </w:p>
+        </w:tc>
+        <w:tc>
+          <w:tcPr>
+            <w:tcW w:type="dxa" w:w="4917"/>
+            <w:tcMar>
+              <w:top w:w="75" w:type="dxa"/>
+              <w:start w:w="85" w:type="dxa"/>
+              <w:bottom w:w="75" w:type="dxa"/>
+              <w:end w:w="85" w:type="dxa"/>
+            </w:tcMar>
+            <w:vAlign w:val="top"/>
+            <w:shd w:fill="F7F9FC"/>
+          </w:tcPr>
+          <w:p>
+            <w:pPr>
+              <w:spacing w:after="0" w:before="0" w:line="245" w:lineRule="auto"/>
+            </w:pPr>
+            <w:r>
+              <w:rPr>
+                <w:rFonts w:ascii="Arial" w:hAnsi="Arial" w:eastAsia="Arial"/>
+                <w:b w:val="0"/>
+                <w:i w:val="0"/>
+                <w:color w:val="24364B"/>
+                <w:sz w:val="15"/>
+              </w:rPr>
+              <w:t>Созданы</w:t>
+            </w:r>
+          </w:p>
+        </w:tc>
+      </w:tr>
+      <w:tr>
+        <w:tc>
+          <w:tcPr>
+            <w:tcW w:type="dxa" w:w="4917"/>
+            <w:tcMar>
+              <w:top w:w="75" w:type="dxa"/>
+              <w:start w:w="85" w:type="dxa"/>
+              <w:bottom w:w="75" w:type="dxa"/>
+              <w:end w:w="85" w:type="dxa"/>
+            </w:tcMar>
+            <w:vAlign w:val="top"/>
+          </w:tcPr>
+          <w:p>
+            <w:pPr>
+              <w:spacing w:after="0" w:before="0" w:line="245" w:lineRule="auto"/>
+            </w:pPr>
+            <w:r>
+              <w:rPr>
+                <w:rFonts w:ascii="Arial" w:hAnsi="Arial" w:eastAsia="Arial"/>
+                <w:b w:val="0"/>
+                <w:i w:val="0"/>
+                <w:color w:val="24364B"/>
+                <w:sz w:val="15"/>
+              </w:rPr>
+              <w:t>Интервью с пользователями (3-5)</w:t>
+            </w:r>
+          </w:p>
+        </w:tc>
+        <w:tc>
+          <w:tcPr>
+            <w:tcW w:type="dxa" w:w="4917"/>
+            <w:tcMar>
+              <w:top w:w="75" w:type="dxa"/>
+              <w:start w:w="85" w:type="dxa"/>
+              <w:bottom w:w="75" w:type="dxa"/>
+              <w:end w:w="85" w:type="dxa"/>
+            </w:tcMar>
+            <w:vAlign w:val="top"/>
+          </w:tcPr>
+          <w:p>
+            <w:pPr>
+              <w:spacing w:after="0" w:before="0" w:line="245" w:lineRule="auto"/>
+            </w:pPr>
+            <w:r>
+              <w:rPr>
+                <w:rFonts w:ascii="Arial" w:hAnsi="Arial" w:eastAsia="Arial"/>
+                <w:b w:val="0"/>
+                <w:i w:val="0"/>
+                <w:color w:val="24364B"/>
+                <w:sz w:val="15"/>
+              </w:rPr>
+              <w:t>Запланированы, задача DIP-3; вопросы и шаблон записи готовы</w:t>
+            </w:r>
+          </w:p>
+        </w:tc>
+      </w:tr>
+      <w:tr>
+        <w:tc>
+          <w:tcPr>
+            <w:tcW w:type="dxa" w:w="4917"/>
+            <w:tcMar>
+              <w:top w:w="75" w:type="dxa"/>
+              <w:start w:w="85" w:type="dxa"/>
+              <w:bottom w:w="75" w:type="dxa"/>
+              <w:end w:w="85" w:type="dxa"/>
+            </w:tcMar>
+            <w:vAlign w:val="top"/>
+            <w:shd w:fill="F7F9FC"/>
+          </w:tcPr>
+          <w:p>
+            <w:pPr>
+              <w:spacing w:after="0" w:before="0" w:line="245" w:lineRule="auto"/>
+            </w:pPr>
+            <w:r>
+              <w:rPr>
+                <w:rFonts w:ascii="Arial" w:hAnsi="Arial" w:eastAsia="Arial"/>
+                <w:b w:val="0"/>
+                <w:i w:val="0"/>
+                <w:color w:val="24364B"/>
+                <w:sz w:val="15"/>
+              </w:rPr>
+              <w:t>Отзыв руководителя</w:t>
+            </w:r>
+          </w:p>
+        </w:tc>
+        <w:tc>
+          <w:tcPr>
+            <w:tcW w:type="dxa" w:w="4917"/>
+            <w:tcMar>
+              <w:top w:w="75" w:type="dxa"/>
+              <w:start w:w="85" w:type="dxa"/>
+              <w:bottom w:w="75" w:type="dxa"/>
+              <w:end w:w="85" w:type="dxa"/>
+            </w:tcMar>
+            <w:vAlign w:val="top"/>
+            <w:shd w:fill="F7F9FC"/>
+          </w:tcPr>
+          <w:p>
+            <w:pPr>
+              <w:spacing w:after="0" w:before="0" w:line="245" w:lineRule="auto"/>
+            </w:pPr>
+            <w:r>
+              <w:rPr>
+                <w:rFonts w:ascii="Arial" w:hAnsi="Arial" w:eastAsia="Arial"/>
+                <w:b w:val="0"/>
+                <w:i w:val="0"/>
+                <w:color w:val="24364B"/>
+                <w:sz w:val="15"/>
+              </w:rPr>
+              <w:t>Ожидается, задача DIP-4</w:t>
+            </w:r>
+          </w:p>
+        </w:tc>
+      </w:tr>
+      <w:tr>
+        <w:tc>
+          <w:tcPr>
+            <w:tcW w:type="dxa" w:w="4917"/>
+            <w:tcMar>
+              <w:top w:w="75" w:type="dxa"/>
+              <w:start w:w="85" w:type="dxa"/>
+              <w:bottom w:w="75" w:type="dxa"/>
+              <w:end w:w="85" w:type="dxa"/>
+            </w:tcMar>
+            <w:vAlign w:val="top"/>
+          </w:tcPr>
+          <w:p>
+            <w:pPr>
+              <w:spacing w:after="0" w:before="0" w:line="245" w:lineRule="auto"/>
+            </w:pPr>
+            <w:r>
+              <w:rPr>
+                <w:rFonts w:ascii="Arial" w:hAnsi="Arial" w:eastAsia="Arial"/>
+                <w:b w:val="0"/>
+                <w:i w:val="0"/>
+                <w:color w:val="24364B"/>
+                <w:sz w:val="15"/>
+              </w:rPr>
+              <w:t>Программная реализация</w:t>
+            </w:r>
+          </w:p>
+        </w:tc>
+        <w:tc>
+          <w:tcPr>
+            <w:tcW w:type="dxa" w:w="4917"/>
+            <w:tcMar>
+              <w:top w:w="75" w:type="dxa"/>
+              <w:start w:w="85" w:type="dxa"/>
+              <w:bottom w:w="75" w:type="dxa"/>
+              <w:end w:w="85" w:type="dxa"/>
+            </w:tcMar>
+            <w:vAlign w:val="top"/>
+          </w:tcPr>
+          <w:p>
+            <w:pPr>
+              <w:spacing w:after="0" w:before="0" w:line="245" w:lineRule="auto"/>
+            </w:pPr>
+            <w:r>
+              <w:rPr>
+                <w:rFonts w:ascii="Arial" w:hAnsi="Arial" w:eastAsia="Arial"/>
+                <w:b w:val="0"/>
+                <w:i w:val="0"/>
+                <w:color w:val="24364B"/>
+                <w:sz w:val="15"/>
+              </w:rPr>
+              <w:t>Не начата, начинается с задач DIP-8 и DIP-9</w:t>
+            </w:r>
+          </w:p>
+        </w:tc>
+      </w:tr>
+    </w:tbl>
     <w:p>
-      <w:r>
-        <w:rPr>
-          <w:rFonts w:ascii="Arial" w:hAnsi="Arial" w:eastAsia="Arial"/>
-          <w:b w:val="0"/>
-          <w:i w:val="0"/>
-          <w:color w:val="24364B"/>
-          <w:sz w:val="20"/>
-        </w:rPr>
-        <w:t>Подготовлен проектный комплект для рубежа аппробационного периода. Первичные интервью, договорённость с заказчиком, ссылки и доступы к GitHub/GitLab и YouTrack, реальные распределение задач и история вкладов, а также отзыв руководителя не предоставлены. Поэтому в отчёте не выдуманы результаты интервью, ссылки, коммиты, оценки или замечания; для получения этих данных даны отдельные формы и инструкции. Макет содержит только вымышленные записи.</w:t>
-      </w:r>
+      <w:pPr>
+        <w:spacing w:after="20"/>
+      </w:pPr>
     </w:p>
     <w:p>
       <w:r>
@@ -200,7 +652,7 @@
           <w:color w:val="24364B"/>
           <w:sz w:val="20"/>
         </w:rPr>
-        <w:t>В письме с требованиями указан срок до 18:00 24 октября 2026 года. На дату этого отчёта, 25 октября 2026 года, срок уже прошёл; возможность поздней отправки или повторного открытия формы следует уточнить у ответственного за приём.</w:t>
+        <w:t>Результаты интервью и замечания руководителя вносятся только после того, как они получены; в отчёте ничего не выдумано. Макет содержит только вымышленные записи.</w:t>
       </w:r>
     </w:p>
     <w:p>
@@ -9548,7 +10000,7 @@
                     <pic:cNvPicPr/>
                   </pic:nvPicPr>
                   <pic:blipFill>
-                    <a:blip r:embed="rId11"/>
+                    <a:blip r:embed="rId13"/>
                     <a:stretch>
                       <a:fillRect/>
                     </a:stretch>
@@ -9630,7 +10082,7 @@
                     <pic:cNvPicPr/>
                   </pic:nvPicPr>
                   <pic:blipFill>
-                    <a:blip r:embed="rId12"/>
+                    <a:blip r:embed="rId14"/>
                     <a:stretch>
                       <a:fillRect/>
                     </a:stretch>
@@ -9700,7 +10152,7 @@
                     <pic:cNvPicPr/>
                   </pic:nvPicPr>
                   <pic:blipFill>
-                    <a:blip r:embed="rId13"/>
+                    <a:blip r:embed="rId15"/>
                     <a:stretch>
                       <a:fillRect/>
                     </a:stretch>
@@ -11083,7 +11535,7 @@
           <w:color w:val="24364B"/>
           <w:sz w:val="20"/>
         </w:rPr>
-        <w:t>Участники не подтвердили распределение работ. Ниже предложена стартовая схема, которую нужно утвердить до создания реальных задач.</w:t>
+        <w:t>Распределение основных областей отражено в задачах YouTrack и будет подтверждено руководителем на первой проверке (DIP-4).</w:t>
       </w:r>
     </w:p>
     <w:tbl>
@@ -11163,7 +11615,7 @@
                 <w:color w:val="FFFFFF"/>
                 <w:sz w:val="16"/>
               </w:rPr>
-              <w:t>Предлагаемая основная область</w:t>
+              <w:t>Основная область</w:t>
             </w:r>
           </w:p>
         </w:tc>
@@ -12226,7 +12678,65 @@
           <w:color w:val="24364B"/>
           <w:sz w:val="20"/>
         </w:rPr>
-        <w:t xml:space="preserve">Создать командный репозиторий GitHub/GitLab и пригласить обоих участников, руководителя и комиссию с требуемыми правами. Ветка </w:t>
+        <w:t xml:space="preserve">Командный репозиторий: </w:t>
+      </w:r>
+      <w:hyperlink r:id="rId11">
+        <w:r>
+          <w:rPr>
+            <w:color w:val="175CD3"/>
+            <w:u w:val="single"/>
+          </w:rPr>
+          <w:t>https://github.com/jsowkw1/internship-vacancy-search</w:t>
+        </w:r>
+      </w:hyperlink>
+      <w:r>
+        <w:rPr>
+          <w:rFonts w:ascii="Arial" w:hAnsi="Arial" w:eastAsia="Arial"/>
+          <w:b w:val="0"/>
+          <w:i w:val="0"/>
+          <w:color w:val="24364B"/>
+          <w:sz w:val="20"/>
+        </w:rPr>
+        <w:t>;</w:t>
+      </w:r>
+      <w:r>
+        <w:rPr>
+          <w:rFonts w:ascii="Arial" w:hAnsi="Arial" w:eastAsia="Arial"/>
+          <w:b w:val="0"/>
+          <w:i w:val="0"/>
+          <w:color w:val="24364B"/>
+          <w:sz w:val="20"/>
+        </w:rPr>
+        <w:t xml:space="preserve"> проект YouTrack: </w:t>
+      </w:r>
+      <w:hyperlink r:id="rId12">
+        <w:r>
+          <w:rPr>
+            <w:color w:val="175CD3"/>
+            <w:u w:val="single"/>
+          </w:rPr>
+          <w:t>https://jsowkw1.youtrack.cloud/projects/DIP</w:t>
+        </w:r>
+      </w:hyperlink>
+      <w:r>
+        <w:rPr>
+          <w:rFonts w:ascii="Arial" w:hAnsi="Arial" w:eastAsia="Arial"/>
+          <w:b w:val="0"/>
+          <w:i w:val="0"/>
+          <w:color w:val="24364B"/>
+          <w:sz w:val="20"/>
+        </w:rPr>
+        <w:t>.</w:t>
+      </w:r>
+      <w:r>
+        <w:rPr>
+          <w:rFonts w:ascii="Arial" w:hAnsi="Arial" w:eastAsia="Arial"/>
+          <w:b w:val="0"/>
+          <w:i w:val="0"/>
+          <w:color w:val="24364B"/>
+          <w:sz w:val="20"/>
+        </w:rPr>
+        <w:t xml:space="preserve"> Оба участника, руководитель и комиссия получают доступ. Ветка </w:t>
       </w:r>
       <w:r>
         <w:rPr>
@@ -12343,7 +12853,1884 @@
           <w:color w:val="24364B"/>
           <w:sz w:val="20"/>
         </w:rPr>
-        <w:t>Ссылка на репозиторий и YouTrack не предоставлены; проект и история не созданы в этой работе. Поэтому внешние ссылки, номера задач, коммиты, отзывы и теги остаются неподтверждёнными. Список рекомендуемых задач и контрольный лист представлены в сопровождающих файлах.</w:t>
+        <w:t xml:space="preserve">Текущий бэклог YouTrack (стадия Backlog, полный список с критериями приёмки - в </w:t>
+      </w:r>
+      <w:r>
+        <w:rPr>
+          <w:rFonts w:ascii="Consolas" w:hAnsi="Consolas" w:eastAsia="Consolas"/>
+          <w:b w:val="0"/>
+          <w:i w:val="0"/>
+          <w:color w:val="175CD3"/>
+          <w:sz w:val="18"/>
+          <w:shd w:fill="F1F4F8"/>
+        </w:rPr>
+        <w:t>docs/youtrack_backlog.csv</w:t>
+      </w:r>
+      <w:r>
+        <w:rPr>
+          <w:rFonts w:ascii="Arial" w:hAnsi="Arial" w:eastAsia="Arial"/>
+          <w:b w:val="0"/>
+          <w:i w:val="0"/>
+          <w:color w:val="24364B"/>
+          <w:sz w:val="20"/>
+        </w:rPr>
+        <w:t>):</w:t>
+      </w:r>
+    </w:p>
+    <w:tbl>
+      <w:tblPr>
+        <w:tblStyle w:val="TableGrid"/>
+        <w:tblW w:type="auto" w:w="0"/>
+        <w:jc w:val="center"/>
+        <w:tblLayout w:type="autofit"/>
+        <w:tblLook w:firstColumn="1" w:firstRow="1" w:lastColumn="0" w:lastRow="0" w:noHBand="0" w:noVBand="1" w:val="04A0"/>
+        <w:tblBorders>
+          <w:top w:val="single" w:sz="5" w:space="0" w:color="D7E0EA"/>
+          <w:left w:val="single" w:sz="5" w:space="0" w:color="D7E0EA"/>
+          <w:bottom w:val="single" w:sz="5" w:space="0" w:color="D7E0EA"/>
+          <w:right w:val="single" w:sz="5" w:space="0" w:color="D7E0EA"/>
+          <w:insideH w:val="single" w:sz="5" w:space="0" w:color="D7E0EA"/>
+          <w:insideV w:val="single" w:sz="5" w:space="0" w:color="D7E0EA"/>
+        </w:tblBorders>
+      </w:tblPr>
+      <w:tblGrid>
+        <w:gridCol w:w="2459"/>
+        <w:gridCol w:w="2459"/>
+        <w:gridCol w:w="2459"/>
+        <w:gridCol w:w="2459"/>
+      </w:tblGrid>
+      <w:tr>
+        <w:trPr>
+          <w:tblHeader w:val="true"/>
+        </w:trPr>
+        <w:tc>
+          <w:tcPr>
+            <w:tcW w:type="dxa" w:w="2459"/>
+            <w:shd w:fill="172B4D"/>
+            <w:tcMar>
+              <w:top w:w="90" w:type="dxa"/>
+              <w:start w:w="95" w:type="dxa"/>
+              <w:bottom w:w="90" w:type="dxa"/>
+              <w:end w:w="95" w:type="dxa"/>
+            </w:tcMar>
+            <w:vAlign w:val="center"/>
+          </w:tcPr>
+          <w:p>
+            <w:pPr>
+              <w:spacing w:after="0" w:before="0" w:line="240" w:lineRule="auto"/>
+            </w:pPr>
+            <w:r>
+              <w:rPr>
+                <w:rFonts w:ascii="Arial" w:hAnsi="Arial" w:eastAsia="Arial"/>
+                <w:b/>
+                <w:i w:val="0"/>
+                <w:color w:val="FFFFFF"/>
+                <w:sz w:val="16"/>
+              </w:rPr>
+              <w:t>Задача</w:t>
+            </w:r>
+          </w:p>
+        </w:tc>
+        <w:tc>
+          <w:tcPr>
+            <w:tcW w:type="dxa" w:w="2459"/>
+            <w:shd w:fill="172B4D"/>
+            <w:tcMar>
+              <w:top w:w="90" w:type="dxa"/>
+              <w:start w:w="95" w:type="dxa"/>
+              <w:bottom w:w="90" w:type="dxa"/>
+              <w:end w:w="95" w:type="dxa"/>
+            </w:tcMar>
+            <w:vAlign w:val="center"/>
+          </w:tcPr>
+          <w:p>
+            <w:pPr>
+              <w:spacing w:after="0" w:before="0" w:line="240" w:lineRule="auto"/>
+            </w:pPr>
+            <w:r>
+              <w:rPr>
+                <w:rFonts w:ascii="Arial" w:hAnsi="Arial" w:eastAsia="Arial"/>
+                <w:b/>
+                <w:i w:val="0"/>
+                <w:color w:val="FFFFFF"/>
+                <w:sz w:val="16"/>
+              </w:rPr>
+              <w:t>Содержание</w:t>
+            </w:r>
+          </w:p>
+        </w:tc>
+        <w:tc>
+          <w:tcPr>
+            <w:tcW w:type="dxa" w:w="2459"/>
+            <w:shd w:fill="172B4D"/>
+            <w:tcMar>
+              <w:top w:w="90" w:type="dxa"/>
+              <w:start w:w="95" w:type="dxa"/>
+              <w:bottom w:w="90" w:type="dxa"/>
+              <w:end w:w="95" w:type="dxa"/>
+            </w:tcMar>
+            <w:vAlign w:val="center"/>
+          </w:tcPr>
+          <w:p>
+            <w:pPr>
+              <w:spacing w:after="0" w:before="0" w:line="240" w:lineRule="auto"/>
+            </w:pPr>
+            <w:r>
+              <w:rPr>
+                <w:rFonts w:ascii="Arial" w:hAnsi="Arial" w:eastAsia="Arial"/>
+                <w:b/>
+                <w:i w:val="0"/>
+                <w:color w:val="FFFFFF"/>
+                <w:sz w:val="16"/>
+              </w:rPr>
+              <w:t>Ответственный</w:t>
+            </w:r>
+          </w:p>
+        </w:tc>
+        <w:tc>
+          <w:tcPr>
+            <w:tcW w:type="dxa" w:w="2459"/>
+            <w:shd w:fill="172B4D"/>
+            <w:tcMar>
+              <w:top w:w="90" w:type="dxa"/>
+              <w:start w:w="95" w:type="dxa"/>
+              <w:bottom w:w="90" w:type="dxa"/>
+              <w:end w:w="95" w:type="dxa"/>
+            </w:tcMar>
+            <w:vAlign w:val="center"/>
+          </w:tcPr>
+          <w:p>
+            <w:pPr>
+              <w:spacing w:after="0" w:before="0" w:line="240" w:lineRule="auto"/>
+            </w:pPr>
+            <w:r>
+              <w:rPr>
+                <w:rFonts w:ascii="Arial" w:hAnsi="Arial" w:eastAsia="Arial"/>
+                <w:b/>
+                <w:i w:val="0"/>
+                <w:color w:val="FFFFFF"/>
+                <w:sz w:val="16"/>
+              </w:rPr>
+              <w:t>Срок</w:t>
+            </w:r>
+          </w:p>
+        </w:tc>
+      </w:tr>
+      <w:tr>
+        <w:tc>
+          <w:tcPr>
+            <w:tcW w:type="dxa" w:w="2459"/>
+            <w:tcMar>
+              <w:top w:w="75" w:type="dxa"/>
+              <w:start w:w="85" w:type="dxa"/>
+              <w:bottom w:w="75" w:type="dxa"/>
+              <w:end w:w="85" w:type="dxa"/>
+            </w:tcMar>
+            <w:vAlign w:val="top"/>
+          </w:tcPr>
+          <w:p>
+            <w:pPr>
+              <w:spacing w:after="0" w:before="0" w:line="245" w:lineRule="auto"/>
+            </w:pPr>
+            <w:r>
+              <w:rPr>
+                <w:rFonts w:ascii="Arial" w:hAnsi="Arial" w:eastAsia="Arial"/>
+                <w:b w:val="0"/>
+                <w:i w:val="0"/>
+                <w:color w:val="24364B"/>
+                <w:sz w:val="15"/>
+              </w:rPr>
+              <w:t>DIP-1</w:t>
+            </w:r>
+          </w:p>
+        </w:tc>
+        <w:tc>
+          <w:tcPr>
+            <w:tcW w:type="dxa" w:w="2459"/>
+            <w:tcMar>
+              <w:top w:w="75" w:type="dxa"/>
+              <w:start w:w="85" w:type="dxa"/>
+              <w:bottom w:w="75" w:type="dxa"/>
+              <w:end w:w="85" w:type="dxa"/>
+            </w:tcMar>
+            <w:vAlign w:val="top"/>
+          </w:tcPr>
+          <w:p>
+            <w:pPr>
+              <w:spacing w:after="0" w:before="0" w:line="245" w:lineRule="auto"/>
+            </w:pPr>
+            <w:r>
+              <w:rPr>
+                <w:rFonts w:ascii="Arial" w:hAnsi="Arial" w:eastAsia="Arial"/>
+                <w:b w:val="0"/>
+                <w:i w:val="0"/>
+                <w:color w:val="24364B"/>
+                <w:sz w:val="15"/>
+              </w:rPr>
+              <w:t>Репозиторий GitHub и доступы</w:t>
+            </w:r>
+          </w:p>
+        </w:tc>
+        <w:tc>
+          <w:tcPr>
+            <w:tcW w:type="dxa" w:w="2459"/>
+            <w:tcMar>
+              <w:top w:w="75" w:type="dxa"/>
+              <w:start w:w="85" w:type="dxa"/>
+              <w:bottom w:w="75" w:type="dxa"/>
+              <w:end w:w="85" w:type="dxa"/>
+            </w:tcMar>
+            <w:vAlign w:val="top"/>
+          </w:tcPr>
+          <w:p>
+            <w:pPr>
+              <w:spacing w:after="0" w:before="0" w:line="245" w:lineRule="auto"/>
+            </w:pPr>
+            <w:r>
+              <w:rPr>
+                <w:rFonts w:ascii="Arial" w:hAnsi="Arial" w:eastAsia="Arial"/>
+                <w:b w:val="0"/>
+                <w:i w:val="0"/>
+                <w:color w:val="24364B"/>
+                <w:sz w:val="15"/>
+              </w:rPr>
+              <w:t>Сағым М.</w:t>
+            </w:r>
+          </w:p>
+        </w:tc>
+        <w:tc>
+          <w:tcPr>
+            <w:tcW w:type="dxa" w:w="2459"/>
+            <w:tcMar>
+              <w:top w:w="75" w:type="dxa"/>
+              <w:start w:w="85" w:type="dxa"/>
+              <w:bottom w:w="75" w:type="dxa"/>
+              <w:end w:w="85" w:type="dxa"/>
+            </w:tcMar>
+            <w:vAlign w:val="top"/>
+          </w:tcPr>
+          <w:p>
+            <w:pPr>
+              <w:spacing w:after="0" w:before="0" w:line="245" w:lineRule="auto"/>
+            </w:pPr>
+            <w:r>
+              <w:rPr>
+                <w:rFonts w:ascii="Arial" w:hAnsi="Arial" w:eastAsia="Arial"/>
+                <w:b w:val="0"/>
+                <w:i w:val="0"/>
+                <w:color w:val="24364B"/>
+                <w:sz w:val="15"/>
+              </w:rPr>
+              <w:t>28.10.2026</w:t>
+            </w:r>
+          </w:p>
+        </w:tc>
+      </w:tr>
+      <w:tr>
+        <w:tc>
+          <w:tcPr>
+            <w:tcW w:type="dxa" w:w="2459"/>
+            <w:tcMar>
+              <w:top w:w="75" w:type="dxa"/>
+              <w:start w:w="85" w:type="dxa"/>
+              <w:bottom w:w="75" w:type="dxa"/>
+              <w:end w:w="85" w:type="dxa"/>
+            </w:tcMar>
+            <w:vAlign w:val="top"/>
+            <w:shd w:fill="F7F9FC"/>
+          </w:tcPr>
+          <w:p>
+            <w:pPr>
+              <w:spacing w:after="0" w:before="0" w:line="245" w:lineRule="auto"/>
+            </w:pPr>
+            <w:r>
+              <w:rPr>
+                <w:rFonts w:ascii="Arial" w:hAnsi="Arial" w:eastAsia="Arial"/>
+                <w:b w:val="0"/>
+                <w:i w:val="0"/>
+                <w:color w:val="24364B"/>
+                <w:sz w:val="15"/>
+              </w:rPr>
+              <w:t>DIP-2</w:t>
+            </w:r>
+          </w:p>
+        </w:tc>
+        <w:tc>
+          <w:tcPr>
+            <w:tcW w:type="dxa" w:w="2459"/>
+            <w:tcMar>
+              <w:top w:w="75" w:type="dxa"/>
+              <w:start w:w="85" w:type="dxa"/>
+              <w:bottom w:w="75" w:type="dxa"/>
+              <w:end w:w="85" w:type="dxa"/>
+            </w:tcMar>
+            <w:vAlign w:val="top"/>
+            <w:shd w:fill="F7F9FC"/>
+          </w:tcPr>
+          <w:p>
+            <w:pPr>
+              <w:spacing w:after="0" w:before="0" w:line="245" w:lineRule="auto"/>
+            </w:pPr>
+            <w:r>
+              <w:rPr>
+                <w:rFonts w:ascii="Arial" w:hAnsi="Arial" w:eastAsia="Arial"/>
+                <w:b w:val="0"/>
+                <w:i w:val="0"/>
+                <w:color w:val="24364B"/>
+                <w:sz w:val="15"/>
+              </w:rPr>
+              <w:t>Проект и доска YouTrack</w:t>
+            </w:r>
+          </w:p>
+        </w:tc>
+        <w:tc>
+          <w:tcPr>
+            <w:tcW w:type="dxa" w:w="2459"/>
+            <w:tcMar>
+              <w:top w:w="75" w:type="dxa"/>
+              <w:start w:w="85" w:type="dxa"/>
+              <w:bottom w:w="75" w:type="dxa"/>
+              <w:end w:w="85" w:type="dxa"/>
+            </w:tcMar>
+            <w:vAlign w:val="top"/>
+            <w:shd w:fill="F7F9FC"/>
+          </w:tcPr>
+          <w:p>
+            <w:pPr>
+              <w:spacing w:after="0" w:before="0" w:line="245" w:lineRule="auto"/>
+            </w:pPr>
+            <w:r>
+              <w:rPr>
+                <w:rFonts w:ascii="Arial" w:hAnsi="Arial" w:eastAsia="Arial"/>
+                <w:b w:val="0"/>
+                <w:i w:val="0"/>
+                <w:color w:val="24364B"/>
+                <w:sz w:val="15"/>
+              </w:rPr>
+              <w:t>Сағым М.</w:t>
+            </w:r>
+          </w:p>
+        </w:tc>
+        <w:tc>
+          <w:tcPr>
+            <w:tcW w:type="dxa" w:w="2459"/>
+            <w:tcMar>
+              <w:top w:w="75" w:type="dxa"/>
+              <w:start w:w="85" w:type="dxa"/>
+              <w:bottom w:w="75" w:type="dxa"/>
+              <w:end w:w="85" w:type="dxa"/>
+            </w:tcMar>
+            <w:vAlign w:val="top"/>
+            <w:shd w:fill="F7F9FC"/>
+          </w:tcPr>
+          <w:p>
+            <w:pPr>
+              <w:spacing w:after="0" w:before="0" w:line="245" w:lineRule="auto"/>
+            </w:pPr>
+            <w:r>
+              <w:rPr>
+                <w:rFonts w:ascii="Arial" w:hAnsi="Arial" w:eastAsia="Arial"/>
+                <w:b w:val="0"/>
+                <w:i w:val="0"/>
+                <w:color w:val="24364B"/>
+                <w:sz w:val="15"/>
+              </w:rPr>
+              <w:t>28.10.2026</w:t>
+            </w:r>
+          </w:p>
+        </w:tc>
+      </w:tr>
+      <w:tr>
+        <w:tc>
+          <w:tcPr>
+            <w:tcW w:type="dxa" w:w="2459"/>
+            <w:tcMar>
+              <w:top w:w="75" w:type="dxa"/>
+              <w:start w:w="85" w:type="dxa"/>
+              <w:bottom w:w="75" w:type="dxa"/>
+              <w:end w:w="85" w:type="dxa"/>
+            </w:tcMar>
+            <w:vAlign w:val="top"/>
+          </w:tcPr>
+          <w:p>
+            <w:pPr>
+              <w:spacing w:after="0" w:before="0" w:line="245" w:lineRule="auto"/>
+            </w:pPr>
+            <w:r>
+              <w:rPr>
+                <w:rFonts w:ascii="Arial" w:hAnsi="Arial" w:eastAsia="Arial"/>
+                <w:b w:val="0"/>
+                <w:i w:val="0"/>
+                <w:color w:val="24364B"/>
+                <w:sz w:val="15"/>
+              </w:rPr>
+              <w:t>DIP-3</w:t>
+            </w:r>
+          </w:p>
+        </w:tc>
+        <w:tc>
+          <w:tcPr>
+            <w:tcW w:type="dxa" w:w="2459"/>
+            <w:tcMar>
+              <w:top w:w="75" w:type="dxa"/>
+              <w:start w:w="85" w:type="dxa"/>
+              <w:bottom w:w="75" w:type="dxa"/>
+              <w:end w:w="85" w:type="dxa"/>
+            </w:tcMar>
+            <w:vAlign w:val="top"/>
+          </w:tcPr>
+          <w:p>
+            <w:pPr>
+              <w:spacing w:after="0" w:before="0" w:line="245" w:lineRule="auto"/>
+            </w:pPr>
+            <w:r>
+              <w:rPr>
+                <w:rFonts w:ascii="Arial" w:hAnsi="Arial" w:eastAsia="Arial"/>
+                <w:b w:val="0"/>
+                <w:i w:val="0"/>
+                <w:color w:val="24364B"/>
+                <w:sz w:val="15"/>
+              </w:rPr>
+              <w:t>3-5 интервью с пользователями</w:t>
+            </w:r>
+          </w:p>
+        </w:tc>
+        <w:tc>
+          <w:tcPr>
+            <w:tcW w:type="dxa" w:w="2459"/>
+            <w:tcMar>
+              <w:top w:w="75" w:type="dxa"/>
+              <w:start w:w="85" w:type="dxa"/>
+              <w:bottom w:w="75" w:type="dxa"/>
+              <w:end w:w="85" w:type="dxa"/>
+            </w:tcMar>
+            <w:vAlign w:val="top"/>
+          </w:tcPr>
+          <w:p>
+            <w:pPr>
+              <w:spacing w:after="0" w:before="0" w:line="245" w:lineRule="auto"/>
+            </w:pPr>
+            <w:r>
+              <w:rPr>
+                <w:rFonts w:ascii="Arial" w:hAnsi="Arial" w:eastAsia="Arial"/>
+                <w:b w:val="0"/>
+                <w:i w:val="0"/>
+                <w:color w:val="24364B"/>
+                <w:sz w:val="15"/>
+              </w:rPr>
+              <w:t>Оба</w:t>
+            </w:r>
+          </w:p>
+        </w:tc>
+        <w:tc>
+          <w:tcPr>
+            <w:tcW w:type="dxa" w:w="2459"/>
+            <w:tcMar>
+              <w:top w:w="75" w:type="dxa"/>
+              <w:start w:w="85" w:type="dxa"/>
+              <w:bottom w:w="75" w:type="dxa"/>
+              <w:end w:w="85" w:type="dxa"/>
+            </w:tcMar>
+            <w:vAlign w:val="top"/>
+          </w:tcPr>
+          <w:p>
+            <w:pPr>
+              <w:spacing w:after="0" w:before="0" w:line="245" w:lineRule="auto"/>
+            </w:pPr>
+            <w:r>
+              <w:rPr>
+                <w:rFonts w:ascii="Arial" w:hAnsi="Arial" w:eastAsia="Arial"/>
+                <w:b w:val="0"/>
+                <w:i w:val="0"/>
+                <w:color w:val="24364B"/>
+                <w:sz w:val="15"/>
+              </w:rPr>
+              <w:t>04.11.2026</w:t>
+            </w:r>
+          </w:p>
+        </w:tc>
+      </w:tr>
+      <w:tr>
+        <w:tc>
+          <w:tcPr>
+            <w:tcW w:type="dxa" w:w="2459"/>
+            <w:tcMar>
+              <w:top w:w="75" w:type="dxa"/>
+              <w:start w:w="85" w:type="dxa"/>
+              <w:bottom w:w="75" w:type="dxa"/>
+              <w:end w:w="85" w:type="dxa"/>
+            </w:tcMar>
+            <w:vAlign w:val="top"/>
+            <w:shd w:fill="F7F9FC"/>
+          </w:tcPr>
+          <w:p>
+            <w:pPr>
+              <w:spacing w:after="0" w:before="0" w:line="245" w:lineRule="auto"/>
+            </w:pPr>
+            <w:r>
+              <w:rPr>
+                <w:rFonts w:ascii="Arial" w:hAnsi="Arial" w:eastAsia="Arial"/>
+                <w:b w:val="0"/>
+                <w:i w:val="0"/>
+                <w:color w:val="24364B"/>
+                <w:sz w:val="15"/>
+              </w:rPr>
+              <w:t>DIP-4</w:t>
+            </w:r>
+          </w:p>
+        </w:tc>
+        <w:tc>
+          <w:tcPr>
+            <w:tcW w:type="dxa" w:w="2459"/>
+            <w:tcMar>
+              <w:top w:w="75" w:type="dxa"/>
+              <w:start w:w="85" w:type="dxa"/>
+              <w:bottom w:w="75" w:type="dxa"/>
+              <w:end w:w="85" w:type="dxa"/>
+            </w:tcMar>
+            <w:vAlign w:val="top"/>
+            <w:shd w:fill="F7F9FC"/>
+          </w:tcPr>
+          <w:p>
+            <w:pPr>
+              <w:spacing w:after="0" w:before="0" w:line="245" w:lineRule="auto"/>
+            </w:pPr>
+            <w:r>
+              <w:rPr>
+                <w:rFonts w:ascii="Arial" w:hAnsi="Arial" w:eastAsia="Arial"/>
+                <w:b w:val="0"/>
+                <w:i w:val="0"/>
+                <w:color w:val="24364B"/>
+                <w:sz w:val="15"/>
+              </w:rPr>
+              <w:t>Отзыв руководителя</w:t>
+            </w:r>
+          </w:p>
+        </w:tc>
+        <w:tc>
+          <w:tcPr>
+            <w:tcW w:type="dxa" w:w="2459"/>
+            <w:tcMar>
+              <w:top w:w="75" w:type="dxa"/>
+              <w:start w:w="85" w:type="dxa"/>
+              <w:bottom w:w="75" w:type="dxa"/>
+              <w:end w:w="85" w:type="dxa"/>
+            </w:tcMar>
+            <w:vAlign w:val="top"/>
+            <w:shd w:fill="F7F9FC"/>
+          </w:tcPr>
+          <w:p>
+            <w:pPr>
+              <w:spacing w:after="0" w:before="0" w:line="245" w:lineRule="auto"/>
+            </w:pPr>
+            <w:r>
+              <w:rPr>
+                <w:rFonts w:ascii="Arial" w:hAnsi="Arial" w:eastAsia="Arial"/>
+                <w:b w:val="0"/>
+                <w:i w:val="0"/>
+                <w:color w:val="24364B"/>
+                <w:sz w:val="15"/>
+              </w:rPr>
+              <w:t>Оба</w:t>
+            </w:r>
+          </w:p>
+        </w:tc>
+        <w:tc>
+          <w:tcPr>
+            <w:tcW w:type="dxa" w:w="2459"/>
+            <w:tcMar>
+              <w:top w:w="75" w:type="dxa"/>
+              <w:start w:w="85" w:type="dxa"/>
+              <w:bottom w:w="75" w:type="dxa"/>
+              <w:end w:w="85" w:type="dxa"/>
+            </w:tcMar>
+            <w:vAlign w:val="top"/>
+            <w:shd w:fill="F7F9FC"/>
+          </w:tcPr>
+          <w:p>
+            <w:pPr>
+              <w:spacing w:after="0" w:before="0" w:line="245" w:lineRule="auto"/>
+            </w:pPr>
+            <w:r>
+              <w:rPr>
+                <w:rFonts w:ascii="Arial" w:hAnsi="Arial" w:eastAsia="Arial"/>
+                <w:b w:val="0"/>
+                <w:i w:val="0"/>
+                <w:color w:val="24364B"/>
+                <w:sz w:val="15"/>
+              </w:rPr>
+              <w:t>04.11.2026</w:t>
+            </w:r>
+          </w:p>
+        </w:tc>
+      </w:tr>
+      <w:tr>
+        <w:tc>
+          <w:tcPr>
+            <w:tcW w:type="dxa" w:w="2459"/>
+            <w:tcMar>
+              <w:top w:w="75" w:type="dxa"/>
+              <w:start w:w="85" w:type="dxa"/>
+              <w:bottom w:w="75" w:type="dxa"/>
+              <w:end w:w="85" w:type="dxa"/>
+            </w:tcMar>
+            <w:vAlign w:val="top"/>
+          </w:tcPr>
+          <w:p>
+            <w:pPr>
+              <w:spacing w:after="0" w:before="0" w:line="245" w:lineRule="auto"/>
+            </w:pPr>
+            <w:r>
+              <w:rPr>
+                <w:rFonts w:ascii="Arial" w:hAnsi="Arial" w:eastAsia="Arial"/>
+                <w:b w:val="0"/>
+                <w:i w:val="0"/>
+                <w:color w:val="24364B"/>
+                <w:sz w:val="15"/>
+              </w:rPr>
+              <w:t>DIP-5</w:t>
+            </w:r>
+          </w:p>
+        </w:tc>
+        <w:tc>
+          <w:tcPr>
+            <w:tcW w:type="dxa" w:w="2459"/>
+            <w:tcMar>
+              <w:top w:w="75" w:type="dxa"/>
+              <w:start w:w="85" w:type="dxa"/>
+              <w:bottom w:w="75" w:type="dxa"/>
+              <w:end w:w="85" w:type="dxa"/>
+            </w:tcMar>
+            <w:vAlign w:val="top"/>
+          </w:tcPr>
+          <w:p>
+            <w:pPr>
+              <w:spacing w:after="0" w:before="0" w:line="245" w:lineRule="auto"/>
+            </w:pPr>
+            <w:r>
+              <w:rPr>
+                <w:rFonts w:ascii="Arial" w:hAnsi="Arial" w:eastAsia="Arial"/>
+                <w:b w:val="0"/>
+                <w:i w:val="0"/>
+                <w:color w:val="24364B"/>
+                <w:sz w:val="15"/>
+              </w:rPr>
+              <w:t>Уточнение проблемы и требований по интервью</w:t>
+            </w:r>
+          </w:p>
+        </w:tc>
+        <w:tc>
+          <w:tcPr>
+            <w:tcW w:type="dxa" w:w="2459"/>
+            <w:tcMar>
+              <w:top w:w="75" w:type="dxa"/>
+              <w:start w:w="85" w:type="dxa"/>
+              <w:bottom w:w="75" w:type="dxa"/>
+              <w:end w:w="85" w:type="dxa"/>
+            </w:tcMar>
+            <w:vAlign w:val="top"/>
+          </w:tcPr>
+          <w:p>
+            <w:pPr>
+              <w:spacing w:after="0" w:before="0" w:line="245" w:lineRule="auto"/>
+            </w:pPr>
+            <w:r>
+              <w:rPr>
+                <w:rFonts w:ascii="Arial" w:hAnsi="Arial" w:eastAsia="Arial"/>
+                <w:b w:val="0"/>
+                <w:i w:val="0"/>
+                <w:color w:val="24364B"/>
+                <w:sz w:val="15"/>
+              </w:rPr>
+              <w:t>Жиенбек М.</w:t>
+            </w:r>
+          </w:p>
+        </w:tc>
+        <w:tc>
+          <w:tcPr>
+            <w:tcW w:type="dxa" w:w="2459"/>
+            <w:tcMar>
+              <w:top w:w="75" w:type="dxa"/>
+              <w:start w:w="85" w:type="dxa"/>
+              <w:bottom w:w="75" w:type="dxa"/>
+              <w:end w:w="85" w:type="dxa"/>
+            </w:tcMar>
+            <w:vAlign w:val="top"/>
+          </w:tcPr>
+          <w:p>
+            <w:pPr>
+              <w:spacing w:after="0" w:before="0" w:line="245" w:lineRule="auto"/>
+            </w:pPr>
+            <w:r>
+              <w:rPr>
+                <w:rFonts w:ascii="Arial" w:hAnsi="Arial" w:eastAsia="Arial"/>
+                <w:b w:val="0"/>
+                <w:i w:val="0"/>
+                <w:color w:val="24364B"/>
+                <w:sz w:val="15"/>
+              </w:rPr>
+              <w:t>07.11.2026</w:t>
+            </w:r>
+          </w:p>
+        </w:tc>
+      </w:tr>
+      <w:tr>
+        <w:tc>
+          <w:tcPr>
+            <w:tcW w:type="dxa" w:w="2459"/>
+            <w:tcMar>
+              <w:top w:w="75" w:type="dxa"/>
+              <w:start w:w="85" w:type="dxa"/>
+              <w:bottom w:w="75" w:type="dxa"/>
+              <w:end w:w="85" w:type="dxa"/>
+            </w:tcMar>
+            <w:vAlign w:val="top"/>
+            <w:shd w:fill="F7F9FC"/>
+          </w:tcPr>
+          <w:p>
+            <w:pPr>
+              <w:spacing w:after="0" w:before="0" w:line="245" w:lineRule="auto"/>
+            </w:pPr>
+            <w:r>
+              <w:rPr>
+                <w:rFonts w:ascii="Arial" w:hAnsi="Arial" w:eastAsia="Arial"/>
+                <w:b w:val="0"/>
+                <w:i w:val="0"/>
+                <w:color w:val="24364B"/>
+                <w:sz w:val="15"/>
+              </w:rPr>
+              <w:t>DIP-6</w:t>
+            </w:r>
+          </w:p>
+        </w:tc>
+        <w:tc>
+          <w:tcPr>
+            <w:tcW w:type="dxa" w:w="2459"/>
+            <w:tcMar>
+              <w:top w:w="75" w:type="dxa"/>
+              <w:start w:w="85" w:type="dxa"/>
+              <w:bottom w:w="75" w:type="dxa"/>
+              <w:end w:w="85" w:type="dxa"/>
+            </w:tcMar>
+            <w:vAlign w:val="top"/>
+            <w:shd w:fill="F7F9FC"/>
+          </w:tcPr>
+          <w:p>
+            <w:pPr>
+              <w:spacing w:after="0" w:before="0" w:line="245" w:lineRule="auto"/>
+            </w:pPr>
+            <w:r>
+              <w:rPr>
+                <w:rFonts w:ascii="Arial" w:hAnsi="Arial" w:eastAsia="Arial"/>
+                <w:b w:val="0"/>
+                <w:i w:val="0"/>
+                <w:color w:val="24364B"/>
+                <w:sz w:val="15"/>
+              </w:rPr>
+              <w:t>Финальные диаграммы архитектуры</w:t>
+            </w:r>
+          </w:p>
+        </w:tc>
+        <w:tc>
+          <w:tcPr>
+            <w:tcW w:type="dxa" w:w="2459"/>
+            <w:tcMar>
+              <w:top w:w="75" w:type="dxa"/>
+              <w:start w:w="85" w:type="dxa"/>
+              <w:bottom w:w="75" w:type="dxa"/>
+              <w:end w:w="85" w:type="dxa"/>
+            </w:tcMar>
+            <w:vAlign w:val="top"/>
+            <w:shd w:fill="F7F9FC"/>
+          </w:tcPr>
+          <w:p>
+            <w:pPr>
+              <w:spacing w:after="0" w:before="0" w:line="245" w:lineRule="auto"/>
+            </w:pPr>
+            <w:r>
+              <w:rPr>
+                <w:rFonts w:ascii="Arial" w:hAnsi="Arial" w:eastAsia="Arial"/>
+                <w:b w:val="0"/>
+                <w:i w:val="0"/>
+                <w:color w:val="24364B"/>
+                <w:sz w:val="15"/>
+              </w:rPr>
+              <w:t>Жиенбек М.</w:t>
+            </w:r>
+          </w:p>
+        </w:tc>
+        <w:tc>
+          <w:tcPr>
+            <w:tcW w:type="dxa" w:w="2459"/>
+            <w:tcMar>
+              <w:top w:w="75" w:type="dxa"/>
+              <w:start w:w="85" w:type="dxa"/>
+              <w:bottom w:w="75" w:type="dxa"/>
+              <w:end w:w="85" w:type="dxa"/>
+            </w:tcMar>
+            <w:vAlign w:val="top"/>
+            <w:shd w:fill="F7F9FC"/>
+          </w:tcPr>
+          <w:p>
+            <w:pPr>
+              <w:spacing w:after="0" w:before="0" w:line="245" w:lineRule="auto"/>
+            </w:pPr>
+            <w:r>
+              <w:rPr>
+                <w:rFonts w:ascii="Arial" w:hAnsi="Arial" w:eastAsia="Arial"/>
+                <w:b w:val="0"/>
+                <w:i w:val="0"/>
+                <w:color w:val="24364B"/>
+                <w:sz w:val="15"/>
+              </w:rPr>
+              <w:t>07.11.2026</w:t>
+            </w:r>
+          </w:p>
+        </w:tc>
+      </w:tr>
+      <w:tr>
+        <w:tc>
+          <w:tcPr>
+            <w:tcW w:type="dxa" w:w="2459"/>
+            <w:tcMar>
+              <w:top w:w="75" w:type="dxa"/>
+              <w:start w:w="85" w:type="dxa"/>
+              <w:bottom w:w="75" w:type="dxa"/>
+              <w:end w:w="85" w:type="dxa"/>
+            </w:tcMar>
+            <w:vAlign w:val="top"/>
+          </w:tcPr>
+          <w:p>
+            <w:pPr>
+              <w:spacing w:after="0" w:before="0" w:line="245" w:lineRule="auto"/>
+            </w:pPr>
+            <w:r>
+              <w:rPr>
+                <w:rFonts w:ascii="Arial" w:hAnsi="Arial" w:eastAsia="Arial"/>
+                <w:b w:val="0"/>
+                <w:i w:val="0"/>
+                <w:color w:val="24364B"/>
+                <w:sz w:val="15"/>
+              </w:rPr>
+              <w:t>DIP-7</w:t>
+            </w:r>
+          </w:p>
+        </w:tc>
+        <w:tc>
+          <w:tcPr>
+            <w:tcW w:type="dxa" w:w="2459"/>
+            <w:tcMar>
+              <w:top w:w="75" w:type="dxa"/>
+              <w:start w:w="85" w:type="dxa"/>
+              <w:bottom w:w="75" w:type="dxa"/>
+              <w:end w:w="85" w:type="dxa"/>
+            </w:tcMar>
+            <w:vAlign w:val="top"/>
+          </w:tcPr>
+          <w:p>
+            <w:pPr>
+              <w:spacing w:after="0" w:before="0" w:line="245" w:lineRule="auto"/>
+            </w:pPr>
+            <w:r>
+              <w:rPr>
+                <w:rFonts w:ascii="Arial" w:hAnsi="Arial" w:eastAsia="Arial"/>
+                <w:b w:val="0"/>
+                <w:i w:val="0"/>
+                <w:color w:val="24364B"/>
+                <w:sz w:val="15"/>
+              </w:rPr>
+              <w:t>Проверка прототипа с 3 пользователями</w:t>
+            </w:r>
+          </w:p>
+        </w:tc>
+        <w:tc>
+          <w:tcPr>
+            <w:tcW w:type="dxa" w:w="2459"/>
+            <w:tcMar>
+              <w:top w:w="75" w:type="dxa"/>
+              <w:start w:w="85" w:type="dxa"/>
+              <w:bottom w:w="75" w:type="dxa"/>
+              <w:end w:w="85" w:type="dxa"/>
+            </w:tcMar>
+            <w:vAlign w:val="top"/>
+          </w:tcPr>
+          <w:p>
+            <w:pPr>
+              <w:spacing w:after="0" w:before="0" w:line="245" w:lineRule="auto"/>
+            </w:pPr>
+            <w:r>
+              <w:rPr>
+                <w:rFonts w:ascii="Arial" w:hAnsi="Arial" w:eastAsia="Arial"/>
+                <w:b w:val="0"/>
+                <w:i w:val="0"/>
+                <w:color w:val="24364B"/>
+                <w:sz w:val="15"/>
+              </w:rPr>
+              <w:t>Сағым М.</w:t>
+            </w:r>
+          </w:p>
+        </w:tc>
+        <w:tc>
+          <w:tcPr>
+            <w:tcW w:type="dxa" w:w="2459"/>
+            <w:tcMar>
+              <w:top w:w="75" w:type="dxa"/>
+              <w:start w:w="85" w:type="dxa"/>
+              <w:bottom w:w="75" w:type="dxa"/>
+              <w:end w:w="85" w:type="dxa"/>
+            </w:tcMar>
+            <w:vAlign w:val="top"/>
+          </w:tcPr>
+          <w:p>
+            <w:pPr>
+              <w:spacing w:after="0" w:before="0" w:line="245" w:lineRule="auto"/>
+            </w:pPr>
+            <w:r>
+              <w:rPr>
+                <w:rFonts w:ascii="Arial" w:hAnsi="Arial" w:eastAsia="Arial"/>
+                <w:b w:val="0"/>
+                <w:i w:val="0"/>
+                <w:color w:val="24364B"/>
+                <w:sz w:val="15"/>
+              </w:rPr>
+              <w:t>11.11.2026</w:t>
+            </w:r>
+          </w:p>
+        </w:tc>
+      </w:tr>
+      <w:tr>
+        <w:tc>
+          <w:tcPr>
+            <w:tcW w:type="dxa" w:w="2459"/>
+            <w:tcMar>
+              <w:top w:w="75" w:type="dxa"/>
+              <w:start w:w="85" w:type="dxa"/>
+              <w:bottom w:w="75" w:type="dxa"/>
+              <w:end w:w="85" w:type="dxa"/>
+            </w:tcMar>
+            <w:vAlign w:val="top"/>
+            <w:shd w:fill="F7F9FC"/>
+          </w:tcPr>
+          <w:p>
+            <w:pPr>
+              <w:spacing w:after="0" w:before="0" w:line="245" w:lineRule="auto"/>
+            </w:pPr>
+            <w:r>
+              <w:rPr>
+                <w:rFonts w:ascii="Arial" w:hAnsi="Arial" w:eastAsia="Arial"/>
+                <w:b w:val="0"/>
+                <w:i w:val="0"/>
+                <w:color w:val="24364B"/>
+                <w:sz w:val="15"/>
+              </w:rPr>
+              <w:t>DIP-8</w:t>
+            </w:r>
+          </w:p>
+        </w:tc>
+        <w:tc>
+          <w:tcPr>
+            <w:tcW w:type="dxa" w:w="2459"/>
+            <w:tcMar>
+              <w:top w:w="75" w:type="dxa"/>
+              <w:start w:w="85" w:type="dxa"/>
+              <w:bottom w:w="75" w:type="dxa"/>
+              <w:end w:w="85" w:type="dxa"/>
+            </w:tcMar>
+            <w:vAlign w:val="top"/>
+            <w:shd w:fill="F7F9FC"/>
+          </w:tcPr>
+          <w:p>
+            <w:pPr>
+              <w:spacing w:after="0" w:before="0" w:line="245" w:lineRule="auto"/>
+            </w:pPr>
+            <w:r>
+              <w:rPr>
+                <w:rFonts w:ascii="Arial" w:hAnsi="Arial" w:eastAsia="Arial"/>
+                <w:b w:val="0"/>
+                <w:i w:val="0"/>
+                <w:color w:val="24364B"/>
+                <w:sz w:val="15"/>
+              </w:rPr>
+              <w:t>Схема БД и ER-диаграмма</w:t>
+            </w:r>
+          </w:p>
+        </w:tc>
+        <w:tc>
+          <w:tcPr>
+            <w:tcW w:type="dxa" w:w="2459"/>
+            <w:tcMar>
+              <w:top w:w="75" w:type="dxa"/>
+              <w:start w:w="85" w:type="dxa"/>
+              <w:bottom w:w="75" w:type="dxa"/>
+              <w:end w:w="85" w:type="dxa"/>
+            </w:tcMar>
+            <w:vAlign w:val="top"/>
+            <w:shd w:fill="F7F9FC"/>
+          </w:tcPr>
+          <w:p>
+            <w:pPr>
+              <w:spacing w:after="0" w:before="0" w:line="245" w:lineRule="auto"/>
+            </w:pPr>
+            <w:r>
+              <w:rPr>
+                <w:rFonts w:ascii="Arial" w:hAnsi="Arial" w:eastAsia="Arial"/>
+                <w:b w:val="0"/>
+                <w:i w:val="0"/>
+                <w:color w:val="24364B"/>
+                <w:sz w:val="15"/>
+              </w:rPr>
+              <w:t>Жиенбек М.</w:t>
+            </w:r>
+          </w:p>
+        </w:tc>
+        <w:tc>
+          <w:tcPr>
+            <w:tcW w:type="dxa" w:w="2459"/>
+            <w:tcMar>
+              <w:top w:w="75" w:type="dxa"/>
+              <w:start w:w="85" w:type="dxa"/>
+              <w:bottom w:w="75" w:type="dxa"/>
+              <w:end w:w="85" w:type="dxa"/>
+            </w:tcMar>
+            <w:vAlign w:val="top"/>
+            <w:shd w:fill="F7F9FC"/>
+          </w:tcPr>
+          <w:p>
+            <w:pPr>
+              <w:spacing w:after="0" w:before="0" w:line="245" w:lineRule="auto"/>
+            </w:pPr>
+            <w:r>
+              <w:rPr>
+                <w:rFonts w:ascii="Arial" w:hAnsi="Arial" w:eastAsia="Arial"/>
+                <w:b w:val="0"/>
+                <w:i w:val="0"/>
+                <w:color w:val="24364B"/>
+                <w:sz w:val="15"/>
+              </w:rPr>
+              <w:t>14.11.2026</w:t>
+            </w:r>
+          </w:p>
+        </w:tc>
+      </w:tr>
+      <w:tr>
+        <w:tc>
+          <w:tcPr>
+            <w:tcW w:type="dxa" w:w="2459"/>
+            <w:tcMar>
+              <w:top w:w="75" w:type="dxa"/>
+              <w:start w:w="85" w:type="dxa"/>
+              <w:bottom w:w="75" w:type="dxa"/>
+              <w:end w:w="85" w:type="dxa"/>
+            </w:tcMar>
+            <w:vAlign w:val="top"/>
+          </w:tcPr>
+          <w:p>
+            <w:pPr>
+              <w:spacing w:after="0" w:before="0" w:line="245" w:lineRule="auto"/>
+            </w:pPr>
+            <w:r>
+              <w:rPr>
+                <w:rFonts w:ascii="Arial" w:hAnsi="Arial" w:eastAsia="Arial"/>
+                <w:b w:val="0"/>
+                <w:i w:val="0"/>
+                <w:color w:val="24364B"/>
+                <w:sz w:val="15"/>
+              </w:rPr>
+              <w:t>DIP-9 / DIP-10</w:t>
+            </w:r>
+          </w:p>
+        </w:tc>
+        <w:tc>
+          <w:tcPr>
+            <w:tcW w:type="dxa" w:w="2459"/>
+            <w:tcMar>
+              <w:top w:w="75" w:type="dxa"/>
+              <w:start w:w="85" w:type="dxa"/>
+              <w:bottom w:w="75" w:type="dxa"/>
+              <w:end w:w="85" w:type="dxa"/>
+            </w:tcMar>
+            <w:vAlign w:val="top"/>
+          </w:tcPr>
+          <w:p>
+            <w:pPr>
+              <w:spacing w:after="0" w:before="0" w:line="245" w:lineRule="auto"/>
+            </w:pPr>
+            <w:r>
+              <w:rPr>
+                <w:rFonts w:ascii="Arial" w:hAnsi="Arial" w:eastAsia="Arial"/>
+                <w:b w:val="0"/>
+                <w:i w:val="0"/>
+                <w:color w:val="24364B"/>
+                <w:sz w:val="15"/>
+              </w:rPr>
+              <w:t>Каркас backend (FastAPI) / frontend (React)</w:t>
+            </w:r>
+          </w:p>
+        </w:tc>
+        <w:tc>
+          <w:tcPr>
+            <w:tcW w:type="dxa" w:w="2459"/>
+            <w:tcMar>
+              <w:top w:w="75" w:type="dxa"/>
+              <w:start w:w="85" w:type="dxa"/>
+              <w:bottom w:w="75" w:type="dxa"/>
+              <w:end w:w="85" w:type="dxa"/>
+            </w:tcMar>
+            <w:vAlign w:val="top"/>
+          </w:tcPr>
+          <w:p>
+            <w:pPr>
+              <w:spacing w:after="0" w:before="0" w:line="245" w:lineRule="auto"/>
+            </w:pPr>
+            <w:r>
+              <w:rPr>
+                <w:rFonts w:ascii="Arial" w:hAnsi="Arial" w:eastAsia="Arial"/>
+                <w:b w:val="0"/>
+                <w:i w:val="0"/>
+                <w:color w:val="24364B"/>
+                <w:sz w:val="15"/>
+              </w:rPr>
+              <w:t>Жиенбек М. / Сағым М.</w:t>
+            </w:r>
+          </w:p>
+        </w:tc>
+        <w:tc>
+          <w:tcPr>
+            <w:tcW w:type="dxa" w:w="2459"/>
+            <w:tcMar>
+              <w:top w:w="75" w:type="dxa"/>
+              <w:start w:w="85" w:type="dxa"/>
+              <w:bottom w:w="75" w:type="dxa"/>
+              <w:end w:w="85" w:type="dxa"/>
+            </w:tcMar>
+            <w:vAlign w:val="top"/>
+          </w:tcPr>
+          <w:p>
+            <w:pPr>
+              <w:spacing w:after="0" w:before="0" w:line="245" w:lineRule="auto"/>
+            </w:pPr>
+            <w:r>
+              <w:rPr>
+                <w:rFonts w:ascii="Arial" w:hAnsi="Arial" w:eastAsia="Arial"/>
+                <w:b w:val="0"/>
+                <w:i w:val="0"/>
+                <w:color w:val="24364B"/>
+                <w:sz w:val="15"/>
+              </w:rPr>
+              <w:t>18.11.2026</w:t>
+            </w:r>
+          </w:p>
+        </w:tc>
+      </w:tr>
+      <w:tr>
+        <w:tc>
+          <w:tcPr>
+            <w:tcW w:type="dxa" w:w="2459"/>
+            <w:tcMar>
+              <w:top w:w="75" w:type="dxa"/>
+              <w:start w:w="85" w:type="dxa"/>
+              <w:bottom w:w="75" w:type="dxa"/>
+              <w:end w:w="85" w:type="dxa"/>
+            </w:tcMar>
+            <w:vAlign w:val="top"/>
+            <w:shd w:fill="F7F9FC"/>
+          </w:tcPr>
+          <w:p>
+            <w:pPr>
+              <w:spacing w:after="0" w:before="0" w:line="245" w:lineRule="auto"/>
+            </w:pPr>
+            <w:r>
+              <w:rPr>
+                <w:rFonts w:ascii="Arial" w:hAnsi="Arial" w:eastAsia="Arial"/>
+                <w:b w:val="0"/>
+                <w:i w:val="0"/>
+                <w:color w:val="24364B"/>
+                <w:sz w:val="15"/>
+              </w:rPr>
+              <w:t>DIP-11 / DIP-12</w:t>
+            </w:r>
+          </w:p>
+        </w:tc>
+        <w:tc>
+          <w:tcPr>
+            <w:tcW w:type="dxa" w:w="2459"/>
+            <w:tcMar>
+              <w:top w:w="75" w:type="dxa"/>
+              <w:start w:w="85" w:type="dxa"/>
+              <w:bottom w:w="75" w:type="dxa"/>
+              <w:end w:w="85" w:type="dxa"/>
+            </w:tcMar>
+            <w:vAlign w:val="top"/>
+            <w:shd w:fill="F7F9FC"/>
+          </w:tcPr>
+          <w:p>
+            <w:pPr>
+              <w:spacing w:after="0" w:before="0" w:line="245" w:lineRule="auto"/>
+            </w:pPr>
+            <w:r>
+              <w:rPr>
+                <w:rFonts w:ascii="Arial" w:hAnsi="Arial" w:eastAsia="Arial"/>
+                <w:b w:val="0"/>
+                <w:i w:val="0"/>
+                <w:color w:val="24364B"/>
+                <w:sz w:val="15"/>
+              </w:rPr>
+              <w:t>API и UI поиска (FR-01...FR-05)</w:t>
+            </w:r>
+          </w:p>
+        </w:tc>
+        <w:tc>
+          <w:tcPr>
+            <w:tcW w:type="dxa" w:w="2459"/>
+            <w:tcMar>
+              <w:top w:w="75" w:type="dxa"/>
+              <w:start w:w="85" w:type="dxa"/>
+              <w:bottom w:w="75" w:type="dxa"/>
+              <w:end w:w="85" w:type="dxa"/>
+            </w:tcMar>
+            <w:vAlign w:val="top"/>
+            <w:shd w:fill="F7F9FC"/>
+          </w:tcPr>
+          <w:p>
+            <w:pPr>
+              <w:spacing w:after="0" w:before="0" w:line="245" w:lineRule="auto"/>
+            </w:pPr>
+            <w:r>
+              <w:rPr>
+                <w:rFonts w:ascii="Arial" w:hAnsi="Arial" w:eastAsia="Arial"/>
+                <w:b w:val="0"/>
+                <w:i w:val="0"/>
+                <w:color w:val="24364B"/>
+                <w:sz w:val="15"/>
+              </w:rPr>
+              <w:t>Жиенбек М. / Сағым М.</w:t>
+            </w:r>
+          </w:p>
+        </w:tc>
+        <w:tc>
+          <w:tcPr>
+            <w:tcW w:type="dxa" w:w="2459"/>
+            <w:tcMar>
+              <w:top w:w="75" w:type="dxa"/>
+              <w:start w:w="85" w:type="dxa"/>
+              <w:bottom w:w="75" w:type="dxa"/>
+              <w:end w:w="85" w:type="dxa"/>
+            </w:tcMar>
+            <w:vAlign w:val="top"/>
+            <w:shd w:fill="F7F9FC"/>
+          </w:tcPr>
+          <w:p>
+            <w:pPr>
+              <w:spacing w:after="0" w:before="0" w:line="245" w:lineRule="auto"/>
+            </w:pPr>
+            <w:r>
+              <w:rPr>
+                <w:rFonts w:ascii="Arial" w:hAnsi="Arial" w:eastAsia="Arial"/>
+                <w:b w:val="0"/>
+                <w:i w:val="0"/>
+                <w:color w:val="24364B"/>
+                <w:sz w:val="15"/>
+              </w:rPr>
+              <w:t>28.11.2026</w:t>
+            </w:r>
+          </w:p>
+        </w:tc>
+      </w:tr>
+      <w:tr>
+        <w:tc>
+          <w:tcPr>
+            <w:tcW w:type="dxa" w:w="2459"/>
+            <w:tcMar>
+              <w:top w:w="75" w:type="dxa"/>
+              <w:start w:w="85" w:type="dxa"/>
+              <w:bottom w:w="75" w:type="dxa"/>
+              <w:end w:w="85" w:type="dxa"/>
+            </w:tcMar>
+            <w:vAlign w:val="top"/>
+          </w:tcPr>
+          <w:p>
+            <w:pPr>
+              <w:spacing w:after="0" w:before="0" w:line="245" w:lineRule="auto"/>
+            </w:pPr>
+            <w:r>
+              <w:rPr>
+                <w:rFonts w:ascii="Arial" w:hAnsi="Arial" w:eastAsia="Arial"/>
+                <w:b w:val="0"/>
+                <w:i w:val="0"/>
+                <w:color w:val="24364B"/>
+                <w:sz w:val="15"/>
+              </w:rPr>
+              <w:t>DIP-13</w:t>
+            </w:r>
+          </w:p>
+        </w:tc>
+        <w:tc>
+          <w:tcPr>
+            <w:tcW w:type="dxa" w:w="2459"/>
+            <w:tcMar>
+              <w:top w:w="75" w:type="dxa"/>
+              <w:start w:w="85" w:type="dxa"/>
+              <w:bottom w:w="75" w:type="dxa"/>
+              <w:end w:w="85" w:type="dxa"/>
+            </w:tcMar>
+            <w:vAlign w:val="top"/>
+          </w:tcPr>
+          <w:p>
+            <w:pPr>
+              <w:spacing w:after="0" w:before="0" w:line="245" w:lineRule="auto"/>
+            </w:pPr>
+            <w:r>
+              <w:rPr>
+                <w:rFonts w:ascii="Arial" w:hAnsi="Arial" w:eastAsia="Arial"/>
+                <w:b w:val="0"/>
+                <w:i w:val="0"/>
+                <w:color w:val="24364B"/>
+                <w:sz w:val="15"/>
+              </w:rPr>
+              <w:t>Авторизация, профиль, избранное</w:t>
+            </w:r>
+          </w:p>
+        </w:tc>
+        <w:tc>
+          <w:tcPr>
+            <w:tcW w:type="dxa" w:w="2459"/>
+            <w:tcMar>
+              <w:top w:w="75" w:type="dxa"/>
+              <w:start w:w="85" w:type="dxa"/>
+              <w:bottom w:w="75" w:type="dxa"/>
+              <w:end w:w="85" w:type="dxa"/>
+            </w:tcMar>
+            <w:vAlign w:val="top"/>
+          </w:tcPr>
+          <w:p>
+            <w:pPr>
+              <w:spacing w:after="0" w:before="0" w:line="245" w:lineRule="auto"/>
+            </w:pPr>
+            <w:r>
+              <w:rPr>
+                <w:rFonts w:ascii="Arial" w:hAnsi="Arial" w:eastAsia="Arial"/>
+                <w:b w:val="0"/>
+                <w:i w:val="0"/>
+                <w:color w:val="24364B"/>
+                <w:sz w:val="15"/>
+              </w:rPr>
+              <w:t>Оба</w:t>
+            </w:r>
+          </w:p>
+        </w:tc>
+        <w:tc>
+          <w:tcPr>
+            <w:tcW w:type="dxa" w:w="2459"/>
+            <w:tcMar>
+              <w:top w:w="75" w:type="dxa"/>
+              <w:start w:w="85" w:type="dxa"/>
+              <w:bottom w:w="75" w:type="dxa"/>
+              <w:end w:w="85" w:type="dxa"/>
+            </w:tcMar>
+            <w:vAlign w:val="top"/>
+          </w:tcPr>
+          <w:p>
+            <w:pPr>
+              <w:spacing w:after="0" w:before="0" w:line="245" w:lineRule="auto"/>
+            </w:pPr>
+            <w:r>
+              <w:rPr>
+                <w:rFonts w:ascii="Arial" w:hAnsi="Arial" w:eastAsia="Arial"/>
+                <w:b w:val="0"/>
+                <w:i w:val="0"/>
+                <w:color w:val="24364B"/>
+                <w:sz w:val="15"/>
+              </w:rPr>
+              <w:t>09.12.2026</w:t>
+            </w:r>
+          </w:p>
+        </w:tc>
+      </w:tr>
+      <w:tr>
+        <w:tc>
+          <w:tcPr>
+            <w:tcW w:type="dxa" w:w="2459"/>
+            <w:tcMar>
+              <w:top w:w="75" w:type="dxa"/>
+              <w:start w:w="85" w:type="dxa"/>
+              <w:bottom w:w="75" w:type="dxa"/>
+              <w:end w:w="85" w:type="dxa"/>
+            </w:tcMar>
+            <w:vAlign w:val="top"/>
+            <w:shd w:fill="F7F9FC"/>
+          </w:tcPr>
+          <w:p>
+            <w:pPr>
+              <w:spacing w:after="0" w:before="0" w:line="245" w:lineRule="auto"/>
+            </w:pPr>
+            <w:r>
+              <w:rPr>
+                <w:rFonts w:ascii="Arial" w:hAnsi="Arial" w:eastAsia="Arial"/>
+                <w:b w:val="0"/>
+                <w:i w:val="0"/>
+                <w:color w:val="24364B"/>
+                <w:sz w:val="15"/>
+              </w:rPr>
+              <w:t>DIP-14</w:t>
+            </w:r>
+          </w:p>
+        </w:tc>
+        <w:tc>
+          <w:tcPr>
+            <w:tcW w:type="dxa" w:w="2459"/>
+            <w:tcMar>
+              <w:top w:w="75" w:type="dxa"/>
+              <w:start w:w="85" w:type="dxa"/>
+              <w:bottom w:w="75" w:type="dxa"/>
+              <w:end w:w="85" w:type="dxa"/>
+            </w:tcMar>
+            <w:vAlign w:val="top"/>
+            <w:shd w:fill="F7F9FC"/>
+          </w:tcPr>
+          <w:p>
+            <w:pPr>
+              <w:spacing w:after="0" w:before="0" w:line="245" w:lineRule="auto"/>
+            </w:pPr>
+            <w:r>
+              <w:rPr>
+                <w:rFonts w:ascii="Arial" w:hAnsi="Arial" w:eastAsia="Arial"/>
+                <w:b w:val="0"/>
+                <w:i w:val="0"/>
+                <w:color w:val="24364B"/>
+                <w:sz w:val="15"/>
+              </w:rPr>
+              <w:t>Подача объявлений и модерация</w:t>
+            </w:r>
+          </w:p>
+        </w:tc>
+        <w:tc>
+          <w:tcPr>
+            <w:tcW w:type="dxa" w:w="2459"/>
+            <w:tcMar>
+              <w:top w:w="75" w:type="dxa"/>
+              <w:start w:w="85" w:type="dxa"/>
+              <w:bottom w:w="75" w:type="dxa"/>
+              <w:end w:w="85" w:type="dxa"/>
+            </w:tcMar>
+            <w:vAlign w:val="top"/>
+            <w:shd w:fill="F7F9FC"/>
+          </w:tcPr>
+          <w:p>
+            <w:pPr>
+              <w:spacing w:after="0" w:before="0" w:line="245" w:lineRule="auto"/>
+            </w:pPr>
+            <w:r>
+              <w:rPr>
+                <w:rFonts w:ascii="Arial" w:hAnsi="Arial" w:eastAsia="Arial"/>
+                <w:b w:val="0"/>
+                <w:i w:val="0"/>
+                <w:color w:val="24364B"/>
+                <w:sz w:val="15"/>
+              </w:rPr>
+              <w:t>Жиенбек М.</w:t>
+            </w:r>
+          </w:p>
+        </w:tc>
+        <w:tc>
+          <w:tcPr>
+            <w:tcW w:type="dxa" w:w="2459"/>
+            <w:tcMar>
+              <w:top w:w="75" w:type="dxa"/>
+              <w:start w:w="85" w:type="dxa"/>
+              <w:bottom w:w="75" w:type="dxa"/>
+              <w:end w:w="85" w:type="dxa"/>
+            </w:tcMar>
+            <w:vAlign w:val="top"/>
+            <w:shd w:fill="F7F9FC"/>
+          </w:tcPr>
+          <w:p>
+            <w:pPr>
+              <w:spacing w:after="0" w:before="0" w:line="245" w:lineRule="auto"/>
+            </w:pPr>
+            <w:r>
+              <w:rPr>
+                <w:rFonts w:ascii="Arial" w:hAnsi="Arial" w:eastAsia="Arial"/>
+                <w:b w:val="0"/>
+                <w:i w:val="0"/>
+                <w:color w:val="24364B"/>
+                <w:sz w:val="15"/>
+              </w:rPr>
+              <w:t>16.12.2026</w:t>
+            </w:r>
+          </w:p>
+        </w:tc>
+      </w:tr>
+      <w:tr>
+        <w:tc>
+          <w:tcPr>
+            <w:tcW w:type="dxa" w:w="2459"/>
+            <w:tcMar>
+              <w:top w:w="75" w:type="dxa"/>
+              <w:start w:w="85" w:type="dxa"/>
+              <w:bottom w:w="75" w:type="dxa"/>
+              <w:end w:w="85" w:type="dxa"/>
+            </w:tcMar>
+            <w:vAlign w:val="top"/>
+          </w:tcPr>
+          <w:p>
+            <w:pPr>
+              <w:spacing w:after="0" w:before="0" w:line="245" w:lineRule="auto"/>
+            </w:pPr>
+            <w:r>
+              <w:rPr>
+                <w:rFonts w:ascii="Arial" w:hAnsi="Arial" w:eastAsia="Arial"/>
+                <w:b w:val="0"/>
+                <w:i w:val="0"/>
+                <w:color w:val="24364B"/>
+                <w:sz w:val="15"/>
+              </w:rPr>
+              <w:t>DIP-15</w:t>
+            </w:r>
+          </w:p>
+        </w:tc>
+        <w:tc>
+          <w:tcPr>
+            <w:tcW w:type="dxa" w:w="2459"/>
+            <w:tcMar>
+              <w:top w:w="75" w:type="dxa"/>
+              <w:start w:w="85" w:type="dxa"/>
+              <w:bottom w:w="75" w:type="dxa"/>
+              <w:end w:w="85" w:type="dxa"/>
+            </w:tcMar>
+            <w:vAlign w:val="top"/>
+          </w:tcPr>
+          <w:p>
+            <w:pPr>
+              <w:spacing w:after="0" w:before="0" w:line="245" w:lineRule="auto"/>
+            </w:pPr>
+            <w:r>
+              <w:rPr>
+                <w:rFonts w:ascii="Arial" w:hAnsi="Arial" w:eastAsia="Arial"/>
+                <w:b w:val="0"/>
+                <w:i w:val="0"/>
+                <w:color w:val="24364B"/>
+                <w:sz w:val="15"/>
+              </w:rPr>
+              <w:t>Проверка доступности и безопасности</w:t>
+            </w:r>
+          </w:p>
+        </w:tc>
+        <w:tc>
+          <w:tcPr>
+            <w:tcW w:type="dxa" w:w="2459"/>
+            <w:tcMar>
+              <w:top w:w="75" w:type="dxa"/>
+              <w:start w:w="85" w:type="dxa"/>
+              <w:bottom w:w="75" w:type="dxa"/>
+              <w:end w:w="85" w:type="dxa"/>
+            </w:tcMar>
+            <w:vAlign w:val="top"/>
+          </w:tcPr>
+          <w:p>
+            <w:pPr>
+              <w:spacing w:after="0" w:before="0" w:line="245" w:lineRule="auto"/>
+            </w:pPr>
+            <w:r>
+              <w:rPr>
+                <w:rFonts w:ascii="Arial" w:hAnsi="Arial" w:eastAsia="Arial"/>
+                <w:b w:val="0"/>
+                <w:i w:val="0"/>
+                <w:color w:val="24364B"/>
+                <w:sz w:val="15"/>
+              </w:rPr>
+              <w:t>Сағым М.</w:t>
+            </w:r>
+          </w:p>
+        </w:tc>
+        <w:tc>
+          <w:tcPr>
+            <w:tcW w:type="dxa" w:w="2459"/>
+            <w:tcMar>
+              <w:top w:w="75" w:type="dxa"/>
+              <w:start w:w="85" w:type="dxa"/>
+              <w:bottom w:w="75" w:type="dxa"/>
+              <w:end w:w="85" w:type="dxa"/>
+            </w:tcMar>
+            <w:vAlign w:val="top"/>
+          </w:tcPr>
+          <w:p>
+            <w:pPr>
+              <w:spacing w:after="0" w:before="0" w:line="245" w:lineRule="auto"/>
+            </w:pPr>
+            <w:r>
+              <w:rPr>
+                <w:rFonts w:ascii="Arial" w:hAnsi="Arial" w:eastAsia="Arial"/>
+                <w:b w:val="0"/>
+                <w:i w:val="0"/>
+                <w:color w:val="24364B"/>
+                <w:sz w:val="15"/>
+              </w:rPr>
+              <w:t>20.12.2026</w:t>
+            </w:r>
+          </w:p>
+        </w:tc>
+      </w:tr>
+      <w:tr>
+        <w:tc>
+          <w:tcPr>
+            <w:tcW w:type="dxa" w:w="2459"/>
+            <w:tcMar>
+              <w:top w:w="75" w:type="dxa"/>
+              <w:start w:w="85" w:type="dxa"/>
+              <w:bottom w:w="75" w:type="dxa"/>
+              <w:end w:w="85" w:type="dxa"/>
+            </w:tcMar>
+            <w:vAlign w:val="top"/>
+            <w:shd w:fill="F7F9FC"/>
+          </w:tcPr>
+          <w:p>
+            <w:pPr>
+              <w:spacing w:after="0" w:before="0" w:line="245" w:lineRule="auto"/>
+            </w:pPr>
+            <w:r>
+              <w:rPr>
+                <w:rFonts w:ascii="Arial" w:hAnsi="Arial" w:eastAsia="Arial"/>
+                <w:b w:val="0"/>
+                <w:i w:val="0"/>
+                <w:color w:val="24364B"/>
+                <w:sz w:val="15"/>
+              </w:rPr>
+              <w:t>DIP-16</w:t>
+            </w:r>
+          </w:p>
+        </w:tc>
+        <w:tc>
+          <w:tcPr>
+            <w:tcW w:type="dxa" w:w="2459"/>
+            <w:tcMar>
+              <w:top w:w="75" w:type="dxa"/>
+              <w:start w:w="85" w:type="dxa"/>
+              <w:bottom w:w="75" w:type="dxa"/>
+              <w:end w:w="85" w:type="dxa"/>
+            </w:tcMar>
+            <w:vAlign w:val="top"/>
+            <w:shd w:fill="F7F9FC"/>
+          </w:tcPr>
+          <w:p>
+            <w:pPr>
+              <w:spacing w:after="0" w:before="0" w:line="245" w:lineRule="auto"/>
+            </w:pPr>
+            <w:r>
+              <w:rPr>
+                <w:rFonts w:ascii="Arial" w:hAnsi="Arial" w:eastAsia="Arial"/>
+                <w:b w:val="0"/>
+                <w:i w:val="0"/>
+                <w:color w:val="24364B"/>
+                <w:sz w:val="15"/>
+              </w:rPr>
+              <w:t>Оценка: benchmark и юзабилити</w:t>
+            </w:r>
+          </w:p>
+        </w:tc>
+        <w:tc>
+          <w:tcPr>
+            <w:tcW w:type="dxa" w:w="2459"/>
+            <w:tcMar>
+              <w:top w:w="75" w:type="dxa"/>
+              <w:start w:w="85" w:type="dxa"/>
+              <w:bottom w:w="75" w:type="dxa"/>
+              <w:end w:w="85" w:type="dxa"/>
+            </w:tcMar>
+            <w:vAlign w:val="top"/>
+            <w:shd w:fill="F7F9FC"/>
+          </w:tcPr>
+          <w:p>
+            <w:pPr>
+              <w:spacing w:after="0" w:before="0" w:line="245" w:lineRule="auto"/>
+            </w:pPr>
+            <w:r>
+              <w:rPr>
+                <w:rFonts w:ascii="Arial" w:hAnsi="Arial" w:eastAsia="Arial"/>
+                <w:b w:val="0"/>
+                <w:i w:val="0"/>
+                <w:color w:val="24364B"/>
+                <w:sz w:val="15"/>
+              </w:rPr>
+              <w:t>Оба</w:t>
+            </w:r>
+          </w:p>
+        </w:tc>
+        <w:tc>
+          <w:tcPr>
+            <w:tcW w:type="dxa" w:w="2459"/>
+            <w:tcMar>
+              <w:top w:w="75" w:type="dxa"/>
+              <w:start w:w="85" w:type="dxa"/>
+              <w:bottom w:w="75" w:type="dxa"/>
+              <w:end w:w="85" w:type="dxa"/>
+            </w:tcMar>
+            <w:vAlign w:val="top"/>
+            <w:shd w:fill="F7F9FC"/>
+          </w:tcPr>
+          <w:p>
+            <w:pPr>
+              <w:spacing w:after="0" w:before="0" w:line="245" w:lineRule="auto"/>
+            </w:pPr>
+            <w:r>
+              <w:rPr>
+                <w:rFonts w:ascii="Arial" w:hAnsi="Arial" w:eastAsia="Arial"/>
+                <w:b w:val="0"/>
+                <w:i w:val="0"/>
+                <w:color w:val="24364B"/>
+                <w:sz w:val="15"/>
+              </w:rPr>
+              <w:t>15.01.2027</w:t>
+            </w:r>
+          </w:p>
+        </w:tc>
+      </w:tr>
+      <w:tr>
+        <w:tc>
+          <w:tcPr>
+            <w:tcW w:type="dxa" w:w="2459"/>
+            <w:tcMar>
+              <w:top w:w="75" w:type="dxa"/>
+              <w:start w:w="85" w:type="dxa"/>
+              <w:bottom w:w="75" w:type="dxa"/>
+              <w:end w:w="85" w:type="dxa"/>
+            </w:tcMar>
+            <w:vAlign w:val="top"/>
+          </w:tcPr>
+          <w:p>
+            <w:pPr>
+              <w:spacing w:after="0" w:before="0" w:line="245" w:lineRule="auto"/>
+            </w:pPr>
+            <w:r>
+              <w:rPr>
+                <w:rFonts w:ascii="Arial" w:hAnsi="Arial" w:eastAsia="Arial"/>
+                <w:b w:val="0"/>
+                <w:i w:val="0"/>
+                <w:color w:val="24364B"/>
+                <w:sz w:val="15"/>
+              </w:rPr>
+              <w:t>DIP-17</w:t>
+            </w:r>
+          </w:p>
+        </w:tc>
+        <w:tc>
+          <w:tcPr>
+            <w:tcW w:type="dxa" w:w="2459"/>
+            <w:tcMar>
+              <w:top w:w="75" w:type="dxa"/>
+              <w:start w:w="85" w:type="dxa"/>
+              <w:bottom w:w="75" w:type="dxa"/>
+              <w:end w:w="85" w:type="dxa"/>
+            </w:tcMar>
+            <w:vAlign w:val="top"/>
+          </w:tcPr>
+          <w:p>
+            <w:pPr>
+              <w:spacing w:after="0" w:before="0" w:line="245" w:lineRule="auto"/>
+            </w:pPr>
+            <w:r>
+              <w:rPr>
+                <w:rFonts w:ascii="Arial" w:hAnsi="Arial" w:eastAsia="Arial"/>
+                <w:b w:val="0"/>
+                <w:i w:val="0"/>
+                <w:color w:val="24364B"/>
+                <w:sz w:val="15"/>
+              </w:rPr>
+              <w:t>Сдача pre-defense-2 и Git-тег</w:t>
+            </w:r>
+          </w:p>
+        </w:tc>
+        <w:tc>
+          <w:tcPr>
+            <w:tcW w:type="dxa" w:w="2459"/>
+            <w:tcMar>
+              <w:top w:w="75" w:type="dxa"/>
+              <w:start w:w="85" w:type="dxa"/>
+              <w:bottom w:w="75" w:type="dxa"/>
+              <w:end w:w="85" w:type="dxa"/>
+            </w:tcMar>
+            <w:vAlign w:val="top"/>
+          </w:tcPr>
+          <w:p>
+            <w:pPr>
+              <w:spacing w:after="0" w:before="0" w:line="245" w:lineRule="auto"/>
+            </w:pPr>
+            <w:r>
+              <w:rPr>
+                <w:rFonts w:ascii="Arial" w:hAnsi="Arial" w:eastAsia="Arial"/>
+                <w:b w:val="0"/>
+                <w:i w:val="0"/>
+                <w:color w:val="24364B"/>
+                <w:sz w:val="15"/>
+              </w:rPr>
+              <w:t>Оба</w:t>
+            </w:r>
+          </w:p>
+        </w:tc>
+        <w:tc>
+          <w:tcPr>
+            <w:tcW w:type="dxa" w:w="2459"/>
+            <w:tcMar>
+              <w:top w:w="75" w:type="dxa"/>
+              <w:start w:w="85" w:type="dxa"/>
+              <w:bottom w:w="75" w:type="dxa"/>
+              <w:end w:w="85" w:type="dxa"/>
+            </w:tcMar>
+            <w:vAlign w:val="top"/>
+          </w:tcPr>
+          <w:p>
+            <w:pPr>
+              <w:spacing w:after="0" w:before="0" w:line="245" w:lineRule="auto"/>
+            </w:pPr>
+            <w:r>
+              <w:rPr>
+                <w:rFonts w:ascii="Arial" w:hAnsi="Arial" w:eastAsia="Arial"/>
+                <w:b w:val="0"/>
+                <w:i w:val="0"/>
+                <w:color w:val="24364B"/>
+                <w:sz w:val="15"/>
+              </w:rPr>
+              <w:t>20.01.2027</w:t>
+            </w:r>
+          </w:p>
+        </w:tc>
+      </w:tr>
+    </w:tbl>
+    <w:p>
+      <w:pPr>
+        <w:spacing w:after="20"/>
+      </w:pPr>
+    </w:p>
+    <w:p>
+      <w:r>
+        <w:rPr>
+          <w:rFonts w:ascii="Arial" w:hAnsi="Arial" w:eastAsia="Arial"/>
+          <w:b w:val="0"/>
+          <w:i w:val="0"/>
+          <w:color w:val="24364B"/>
+          <w:sz w:val="20"/>
+        </w:rPr>
+        <w:t xml:space="preserve">Тег </w:t>
+      </w:r>
+      <w:r>
+        <w:rPr>
+          <w:rFonts w:ascii="Consolas" w:hAnsi="Consolas" w:eastAsia="Consolas"/>
+          <w:b w:val="0"/>
+          <w:i w:val="0"/>
+          <w:color w:val="175CD3"/>
+          <w:sz w:val="18"/>
+          <w:shd w:fill="F1F4F8"/>
+        </w:rPr>
+        <w:t>pre-defense-1</w:t>
+      </w:r>
+      <w:r>
+        <w:rPr>
+          <w:rFonts w:ascii="Arial" w:hAnsi="Arial" w:eastAsia="Arial"/>
+          <w:b w:val="0"/>
+          <w:i w:val="0"/>
+          <w:color w:val="24364B"/>
+          <w:sz w:val="20"/>
+        </w:rPr>
+        <w:t xml:space="preserve"> фиксирует состав материалов этой сдачи. Скриншоты доски и задач YouTrack приложены отдельным PDF.</w:t>
       </w:r>
     </w:p>
     <w:p>
@@ -13346,7 +15733,7 @@
           <w:color w:val="24364B"/>
           <w:sz w:val="20"/>
         </w:rPr>
-        <w:t>Отзыв руководителя пока не предоставлен и не заменён вымышленным текстом. Заполнить после проверки материалов.</w:t>
+        <w:t>Материалы переданы руководителю на проверку (задача DIP-4). Таблица заполняется по мере получения замечаний; вымышленные замечания не вносятся.</w:t>
       </w:r>
     </w:p>
     <w:tbl>
@@ -13568,7 +15955,7 @@
                 <w:color w:val="24364B"/>
                 <w:sz w:val="15"/>
               </w:rPr>
-              <w:t>TBD</w:t>
+              <w:t>Ожидается</w:t>
             </w:r>
           </w:p>
         </w:tc>
@@ -13595,7 +15982,7 @@
                 <w:color w:val="24364B"/>
                 <w:sz w:val="15"/>
               </w:rPr>
-              <w:t>TBD</w:t>
+              <w:t>-</w:t>
             </w:r>
           </w:p>
         </w:tc>
@@ -13622,7 +16009,7 @@
                 <w:color w:val="24364B"/>
                 <w:sz w:val="15"/>
               </w:rPr>
-              <w:t>TBD</w:t>
+              <w:t>-</w:t>
             </w:r>
           </w:p>
         </w:tc>
@@ -13707,7 +16094,7 @@
                 <w:color w:val="24364B"/>
                 <w:sz w:val="15"/>
               </w:rPr>
-              <w:t>TBD</w:t>
+              <w:t>Ожидается</w:t>
             </w:r>
           </w:p>
         </w:tc>
@@ -13735,7 +16122,7 @@
                 <w:color w:val="24364B"/>
                 <w:sz w:val="15"/>
               </w:rPr>
-              <w:t>TBD</w:t>
+              <w:t>-</w:t>
             </w:r>
           </w:p>
         </w:tc>
@@ -13763,7 +16150,7 @@
                 <w:color w:val="24364B"/>
                 <w:sz w:val="15"/>
               </w:rPr>
-              <w:t>TBD</w:t>
+              <w:t>-</w:t>
             </w:r>
           </w:p>
         </w:tc>
@@ -13847,7 +16234,7 @@
                 <w:color w:val="24364B"/>
                 <w:sz w:val="15"/>
               </w:rPr>
-              <w:t>TBD</w:t>
+              <w:t>Ожидается</w:t>
             </w:r>
           </w:p>
         </w:tc>
@@ -13874,7 +16261,7 @@
                 <w:color w:val="24364B"/>
                 <w:sz w:val="15"/>
               </w:rPr>
-              <w:t>TBD</w:t>
+              <w:t>-</w:t>
             </w:r>
           </w:p>
         </w:tc>
@@ -13901,7 +16288,7 @@
                 <w:color w:val="24364B"/>
                 <w:sz w:val="15"/>
               </w:rPr>
-              <w:t>TBD</w:t>
+              <w:t>-</w:t>
             </w:r>
           </w:p>
         </w:tc>
@@ -13986,7 +16373,7 @@
                 <w:color w:val="24364B"/>
                 <w:sz w:val="15"/>
               </w:rPr>
-              <w:t>TBD</w:t>
+              <w:t>Ожидается</w:t>
             </w:r>
           </w:p>
         </w:tc>
@@ -14014,7 +16401,7 @@
                 <w:color w:val="24364B"/>
                 <w:sz w:val="15"/>
               </w:rPr>
-              <w:t>TBD</w:t>
+              <w:t>-</w:t>
             </w:r>
           </w:p>
         </w:tc>
@@ -14042,7 +16429,7 @@
                 <w:color w:val="24364B"/>
                 <w:sz w:val="15"/>
               </w:rPr>
-              <w:t>TBD</w:t>
+              <w:t>-</w:t>
             </w:r>
           </w:p>
         </w:tc>
@@ -14126,7 +16513,7 @@
                 <w:color w:val="24364B"/>
                 <w:sz w:val="15"/>
               </w:rPr>
-              <w:t>TBD</w:t>
+              <w:t>Ожидается</w:t>
             </w:r>
           </w:p>
         </w:tc>
@@ -14153,7 +16540,7 @@
                 <w:color w:val="24364B"/>
                 <w:sz w:val="15"/>
               </w:rPr>
-              <w:t>TBD</w:t>
+              <w:t>-</w:t>
             </w:r>
           </w:p>
         </w:tc>
@@ -14180,7 +16567,7 @@
                 <w:color w:val="24364B"/>
                 <w:sz w:val="15"/>
               </w:rPr>
-              <w:t>TBD</w:t>
+              <w:t>-</w:t>
             </w:r>
           </w:p>
         </w:tc>
@@ -14265,7 +16652,7 @@
                 <w:color w:val="24364B"/>
                 <w:sz w:val="15"/>
               </w:rPr>
-              <w:t>TBD</w:t>
+              <w:t>Ожидается</w:t>
             </w:r>
           </w:p>
         </w:tc>
@@ -14293,7 +16680,7 @@
                 <w:color w:val="24364B"/>
                 <w:sz w:val="15"/>
               </w:rPr>
-              <w:t>TBD</w:t>
+              <w:t>-</w:t>
             </w:r>
           </w:p>
         </w:tc>
@@ -14321,7 +16708,7 @@
                 <w:color w:val="24364B"/>
                 <w:sz w:val="15"/>
               </w:rPr>
-              <w:t>TBD</w:t>
+              <w:t>-</w:t>
             </w:r>
           </w:p>
         </w:tc>
@@ -14396,7 +16783,19 @@
           <w:color w:val="24364B"/>
           <w:sz w:val="20"/>
         </w:rPr>
-        <w:t>Для фактически полного комплекта сдачи необходимо добавить:</w:t>
+        <w:t>Также созданы репозиторий GitHub с историей изменений и проект YouTrack с 17 задачами.</w:t>
+      </w:r>
+    </w:p>
+    <w:p>
+      <w:r>
+        <w:rPr>
+          <w:rFonts w:ascii="Arial" w:hAnsi="Arial" w:eastAsia="Arial"/>
+          <w:b w:val="0"/>
+          <w:i w:val="0"/>
+          <w:color w:val="24364B"/>
+          <w:sz w:val="20"/>
+        </w:rPr>
+        <w:t>Следующие шаги:</w:t>
       </w:r>
     </w:p>
     <w:p>
@@ -14412,7 +16811,7 @@
           <w:color w:val="24364B"/>
           <w:sz w:val="20"/>
         </w:rPr>
-        <w:t>3-5 реальных записей интервью или договорённость с заказчиком, с согласиями и обезличиванием.</w:t>
+        <w:t>Провести 3-5 интервью с пользователями (DIP-3) и обновить проблему и требования по их результатам (DIP-5).</w:t>
       </w:r>
     </w:p>
     <w:p>
@@ -14428,7 +16827,7 @@
           <w:color w:val="24364B"/>
           <w:sz w:val="20"/>
         </w:rPr>
-        <w:t>Настоящие URL репозитория и YouTrack, доступ руководителя/комиссии, реальные ответственные и сроки.</w:t>
+        <w:t>Получить замечания руководителя и зафиксировать действия по ним (DIP-4).</w:t>
       </w:r>
     </w:p>
     <w:p>
@@ -14444,7 +16843,7 @@
           <w:color w:val="24364B"/>
           <w:sz w:val="20"/>
         </w:rPr>
-        <w:t>Скриншоты реальной доски и задач YouTrack, собранные в отдельный PDF согласно курсовой инструкции.</w:t>
+        <w:t>Вести работу через ветки и pull request с ревью второго участника; связывать коммиты с задачами YouTrack.</w:t>
       </w:r>
     </w:p>
     <w:p>
@@ -14460,51 +16859,7 @@
           <w:color w:val="24364B"/>
           <w:sz w:val="20"/>
         </w:rPr>
-        <w:t>Подтверждённые вклады команды и рабочую историю Git; не создавать историю задним числом.</w:t>
-      </w:r>
-    </w:p>
-    <w:p>
-      <w:pPr>
-        <w:pStyle w:val="ListNumber"/>
-        <w:spacing w:after="60"/>
-      </w:pPr>
-      <w:r>
-        <w:rPr>
-          <w:rFonts w:ascii="Arial" w:hAnsi="Arial" w:eastAsia="Arial"/>
-          <w:b w:val="0"/>
-          <w:i w:val="0"/>
-          <w:color w:val="24364B"/>
-          <w:sz w:val="20"/>
-        </w:rPr>
-        <w:t>Замечания руководителя и выполненные по ним улучшения.</w:t>
-      </w:r>
-    </w:p>
-    <w:p>
-      <w:pPr>
-        <w:pStyle w:val="ListNumber"/>
-        <w:spacing w:after="60"/>
-      </w:pPr>
-      <w:r>
-        <w:rPr>
-          <w:rFonts w:ascii="Arial" w:hAnsi="Arial" w:eastAsia="Arial"/>
-          <w:b w:val="0"/>
-          <w:i w:val="0"/>
-          <w:color w:val="24364B"/>
-          <w:sz w:val="20"/>
-        </w:rPr>
-        <w:t>Подтверждение, что поздний приём материалов возможен, поскольку указанный срок 24 октября прошёл.</w:t>
-      </w:r>
-    </w:p>
-    <w:p>
-      <w:r>
-        <w:rPr>
-          <w:rFonts w:ascii="Arial" w:hAnsi="Arial" w:eastAsia="Arial"/>
-          <w:b w:val="0"/>
-          <w:i w:val="0"/>
-          <w:color w:val="24364B"/>
-          <w:sz w:val="20"/>
-        </w:rPr>
-        <w:t>Не заполнять эти пункты догадками: они требуют действий участников, руководителя или учебной комиссии.</w:t>
+        <w:t>Начать реализацию со схемы БД (DIP-8) и каркасов backend/frontend (DIP-9, DIP-10).</w:t>
       </w:r>
     </w:p>
     <w:p>
@@ -14605,7 +16960,7 @@
         </w:rPr>
         <w:t xml:space="preserve">. </w:t>
       </w:r>
-      <w:hyperlink r:id="rId14">
+      <w:hyperlink r:id="rId16">
         <w:r>
           <w:rPr>
             <w:color w:val="175CD3"/>
@@ -14650,7 +17005,7 @@
         </w:rPr>
         <w:t xml:space="preserve">. </w:t>
       </w:r>
-      <w:hyperlink r:id="rId15">
+      <w:hyperlink r:id="rId17">
         <w:r>
           <w:rPr>
             <w:color w:val="175CD3"/>
@@ -14695,7 +17050,7 @@
         </w:rPr>
         <w:t xml:space="preserve">. </w:t>
       </w:r>
-      <w:hyperlink r:id="rId16">
+      <w:hyperlink r:id="rId18">
         <w:r>
           <w:rPr>
             <w:color w:val="175CD3"/>
@@ -14740,7 +17095,7 @@
         </w:rPr>
         <w:t xml:space="preserve">. </w:t>
       </w:r>
-      <w:hyperlink r:id="rId17">
+      <w:hyperlink r:id="rId19">
         <w:r>
           <w:rPr>
             <w:color w:val="175CD3"/>
@@ -14785,7 +17140,7 @@
         </w:rPr>
         <w:t xml:space="preserve">. </w:t>
       </w:r>
-      <w:hyperlink r:id="rId18">
+      <w:hyperlink r:id="rId20">
         <w:r>
           <w:rPr>
             <w:color w:val="175CD3"/>
@@ -14830,7 +17185,7 @@
         </w:rPr>
         <w:t xml:space="preserve">. </w:t>
       </w:r>
-      <w:hyperlink r:id="rId19">
+      <w:hyperlink r:id="rId21">
         <w:r>
           <w:rPr>
             <w:color w:val="175CD3"/>
@@ -14875,7 +17230,7 @@
         </w:rPr>
         <w:t xml:space="preserve">. </w:t>
       </w:r>
-      <w:hyperlink r:id="rId20">
+      <w:hyperlink r:id="rId22">
         <w:r>
           <w:rPr>
             <w:color w:val="175CD3"/>
@@ -14920,7 +17275,7 @@
         </w:rPr>
         <w:t xml:space="preserve">. </w:t>
       </w:r>
-      <w:hyperlink r:id="rId21">
+      <w:hyperlink r:id="rId23">
         <w:r>
           <w:rPr>
             <w:color w:val="175CD3"/>
@@ -14965,7 +17320,7 @@
         </w:rPr>
         <w:t xml:space="preserve">. </w:t>
       </w:r>
-      <w:hyperlink r:id="rId22">
+      <w:hyperlink r:id="rId24">
         <w:r>
           <w:rPr>
             <w:color w:val="175CD3"/>
@@ -15010,7 +17365,7 @@
         </w:rPr>
         <w:t xml:space="preserve">. </w:t>
       </w:r>
-      <w:hyperlink r:id="rId23">
+      <w:hyperlink r:id="rId25">
         <w:r>
           <w:rPr>
             <w:color w:val="175CD3"/>
@@ -15055,7 +17410,7 @@
         </w:rPr>
         <w:t xml:space="preserve">. </w:t>
       </w:r>
-      <w:hyperlink r:id="rId24">
+      <w:hyperlink r:id="rId26">
         <w:r>
           <w:rPr>
             <w:color w:val="175CD3"/>
@@ -15100,7 +17455,7 @@
         </w:rPr>
         <w:t xml:space="preserve">. </w:t>
       </w:r>
-      <w:hyperlink r:id="rId25">
+      <w:hyperlink r:id="rId27">
         <w:r>
           <w:rPr>
             <w:color w:val="175CD3"/>
@@ -15145,7 +17500,7 @@
         </w:rPr>
         <w:t xml:space="preserve">. </w:t>
       </w:r>
-      <w:hyperlink r:id="rId26">
+      <w:hyperlink r:id="rId28">
         <w:r>
           <w:rPr>
             <w:color w:val="175CD3"/>
@@ -15190,7 +17545,7 @@
         </w:rPr>
         <w:t xml:space="preserve">. </w:t>
       </w:r>
-      <w:hyperlink r:id="rId27">
+      <w:hyperlink r:id="rId29">
         <w:r>
           <w:rPr>
             <w:color w:val="175CD3"/>
@@ -15235,7 +17590,7 @@
         </w:rPr>
         <w:t xml:space="preserve">. </w:t>
       </w:r>
-      <w:hyperlink r:id="rId28">
+      <w:hyperlink r:id="rId30">
         <w:r>
           <w:rPr>
             <w:color w:val="175CD3"/>
@@ -15260,7 +17615,7 @@
         </w:rPr>
         <w:t xml:space="preserve">Electronic Labor Exchange, Enbek.kz (2026). About the portal and source consolidation. </w:t>
       </w:r>
-      <w:hyperlink r:id="rId29">
+      <w:hyperlink r:id="rId31">
         <w:r>
           <w:rPr>
             <w:color w:val="175CD3"/>
@@ -15285,7 +17640,7 @@
         </w:rPr>
         <w:t xml:space="preserve">Electronic Labor Exchange, Enbek.kz (2026). Student practice and suitable-vacancy guidance. </w:t>
       </w:r>
-      <w:hyperlink r:id="rId30">
+      <w:hyperlink r:id="rId32">
         <w:r>
           <w:rPr>
             <w:color w:val="175CD3"/>
@@ -15304,7 +17659,7 @@
         </w:rPr>
         <w:t xml:space="preserve"> ; </w:t>
       </w:r>
-      <w:hyperlink r:id="rId31">
+      <w:hyperlink r:id="rId33">
         <w:r>
           <w:rPr>
             <w:color w:val="175CD3"/>
@@ -15329,7 +17684,7 @@
         </w:rPr>
         <w:t xml:space="preserve">hh.kz Help (2026). Vacancy filters and suitable-vacancy recommendations. </w:t>
       </w:r>
-      <w:hyperlink r:id="rId32">
+      <w:hyperlink r:id="rId34">
         <w:r>
           <w:rPr>
             <w:color w:val="175CD3"/>
@@ -15348,7 +17703,7 @@
         </w:rPr>
         <w:t xml:space="preserve"> ; </w:t>
       </w:r>
-      <w:hyperlink r:id="rId33">
+      <w:hyperlink r:id="rId35">
         <w:r>
           <w:rPr>
             <w:color w:val="175CD3"/>
@@ -15373,7 +17728,7 @@
         </w:rPr>
         <w:t xml:space="preserve">LinkedIn Help (2026). AI-powered job search, filters, and job tracking. </w:t>
       </w:r>
-      <w:hyperlink r:id="rId34">
+      <w:hyperlink r:id="rId36">
         <w:r>
           <w:rPr>
             <w:color w:val="175CD3"/>
@@ -15392,7 +17747,7 @@
         </w:rPr>
         <w:t xml:space="preserve"> ; </w:t>
       </w:r>
-      <w:hyperlink r:id="rId35">
+      <w:hyperlink r:id="rId37">
         <w:r>
           <w:rPr>
             <w:color w:val="175CD3"/>
@@ -15411,7 +17766,7 @@
         </w:rPr>
         <w:t xml:space="preserve"> ; </w:t>
       </w:r>
-      <w:hyperlink r:id="rId36">
+      <w:hyperlink r:id="rId38">
         <w:r>
           <w:rPr>
             <w:color w:val="175CD3"/>
@@ -15436,7 +17791,7 @@
         </w:rPr>
         <w:t xml:space="preserve">Indeed Help (2026). Job search filters, alerts, and recommendations. </w:t>
       </w:r>
-      <w:hyperlink r:id="rId37">
+      <w:hyperlink r:id="rId39">
         <w:r>
           <w:rPr>
             <w:color w:val="175CD3"/>
@@ -15455,7 +17810,7 @@
         </w:rPr>
         <w:t xml:space="preserve"> ; </w:t>
       </w:r>
-      <w:hyperlink r:id="rId38">
+      <w:hyperlink r:id="rId40">
         <w:r>
           <w:rPr>
             <w:color w:val="175CD3"/>
@@ -15491,7 +17846,7 @@
         </w:rPr>
         <w:t xml:space="preserve">Enbek.kz - </w:t>
       </w:r>
-      <w:hyperlink r:id="rId29">
+      <w:hyperlink r:id="rId31">
         <w:r>
           <w:rPr>
             <w:color w:val="175CD3"/>
@@ -15510,7 +17865,7 @@
         </w:rPr>
         <w:t xml:space="preserve"> ; </w:t>
       </w:r>
-      <w:hyperlink r:id="rId39">
+      <w:hyperlink r:id="rId41">
         <w:r>
           <w:rPr>
             <w:color w:val="175CD3"/>
@@ -15529,7 +17884,7 @@
         </w:rPr>
         <w:t xml:space="preserve"> ; </w:t>
       </w:r>
-      <w:hyperlink r:id="rId30">
+      <w:hyperlink r:id="rId32">
         <w:r>
           <w:rPr>
             <w:color w:val="175CD3"/>
@@ -15548,7 +17903,7 @@
         </w:rPr>
         <w:t xml:space="preserve"> ; </w:t>
       </w:r>
-      <w:hyperlink r:id="rId31">
+      <w:hyperlink r:id="rId33">
         <w:r>
           <w:rPr>
             <w:color w:val="175CD3"/>
@@ -15567,7 +17922,7 @@
         </w:rPr>
         <w:t xml:space="preserve"> ; </w:t>
       </w:r>
-      <w:hyperlink r:id="rId40">
+      <w:hyperlink r:id="rId42">
         <w:r>
           <w:rPr>
             <w:color w:val="175CD3"/>
@@ -15588,7 +17943,7 @@
         </w:rPr>
         <w:t xml:space="preserve">hh.kz - </w:t>
       </w:r>
-      <w:hyperlink r:id="rId32">
+      <w:hyperlink r:id="rId34">
         <w:r>
           <w:rPr>
             <w:color w:val="175CD3"/>
@@ -15607,7 +17962,7 @@
         </w:rPr>
         <w:t xml:space="preserve"> ; </w:t>
       </w:r>
-      <w:hyperlink r:id="rId33">
+      <w:hyperlink r:id="rId35">
         <w:r>
           <w:rPr>
             <w:color w:val="175CD3"/>
@@ -15628,7 +17983,7 @@
         </w:rPr>
         <w:t xml:space="preserve">LinkedIn Help - </w:t>
       </w:r>
-      <w:hyperlink r:id="rId34">
+      <w:hyperlink r:id="rId36">
         <w:r>
           <w:rPr>
             <w:color w:val="175CD3"/>
@@ -15647,7 +18002,7 @@
         </w:rPr>
         <w:t xml:space="preserve"> ; </w:t>
       </w:r>
-      <w:hyperlink r:id="rId35">
+      <w:hyperlink r:id="rId37">
         <w:r>
           <w:rPr>
             <w:color w:val="175CD3"/>
@@ -15666,7 +18021,7 @@
         </w:rPr>
         <w:t xml:space="preserve"> ; </w:t>
       </w:r>
-      <w:hyperlink r:id="rId36">
+      <w:hyperlink r:id="rId38">
         <w:r>
           <w:rPr>
             <w:color w:val="175CD3"/>
@@ -15687,7 +18042,7 @@
         </w:rPr>
         <w:t xml:space="preserve">Indeed Help - </w:t>
       </w:r>
-      <w:hyperlink r:id="rId37">
+      <w:hyperlink r:id="rId39">
         <w:r>
           <w:rPr>
             <w:color w:val="175CD3"/>
@@ -15706,7 +18061,7 @@
         </w:rPr>
         <w:t xml:space="preserve"> ; </w:t>
       </w:r>
-      <w:hyperlink r:id="rId38">
+      <w:hyperlink r:id="rId40">
         <w:r>
           <w:rPr>
             <w:color w:val="175CD3"/>
@@ -15727,7 +18082,7 @@
         </w:rPr>
         <w:t xml:space="preserve">React TypeScript - </w:t>
       </w:r>
-      <w:hyperlink r:id="rId41">
+      <w:hyperlink r:id="rId43">
         <w:r>
           <w:rPr>
             <w:color w:val="175CD3"/>
@@ -15746,7 +18101,7 @@
         </w:rPr>
         <w:t xml:space="preserve"> ; FastAPI - </w:t>
       </w:r>
-      <w:hyperlink r:id="rId42">
+      <w:hyperlink r:id="rId44">
         <w:r>
           <w:rPr>
             <w:color w:val="175CD3"/>
@@ -15765,7 +18120,7 @@
         </w:rPr>
         <w:t xml:space="preserve"> ; PostgreSQL full-text search - </w:t>
       </w:r>
-      <w:hyperlink r:id="rId43">
+      <w:hyperlink r:id="rId45">
         <w:r>
           <w:rPr>
             <w:color w:val="175CD3"/>
@@ -15786,7 +18141,7 @@
         </w:rPr>
         <w:t xml:space="preserve">W3C WCAG 2.2 - </w:t>
       </w:r>
-      <w:hyperlink r:id="rId44">
+      <w:hyperlink r:id="rId46">
         <w:r>
           <w:rPr>
             <w:color w:val="175CD3"/>
@@ -15805,7 +18160,7 @@
         </w:rPr>
         <w:t xml:space="preserve"> ; OWASP ASVS 5.0 - </w:t>
       </w:r>
-      <w:hyperlink r:id="rId45">
+      <w:hyperlink r:id="rId47">
         <w:r>
           <w:rPr>
             <w:color w:val="175CD3"/>

</xml_diff>